<commit_message>
docs: residuos de la auditoría de 2.ª instancia hallados al releerla
B-08 quedaba a medias: el canvas de la Figura 6 rotula el nodo 17
«Enviar Respuesta (Producción)» y la Tabla 4.7 lo llamaba «(canal
simulado)». La tabla adopta el rótulo del canvas y aclara que no designa
los workflows de producción del Capítulo 7.

Dos inconsistencias que había dejado la corrección de E7: §4.4.3 decía
«workflow de diecinueve nodos» contando la nota adhesiva (son 18, los de
la Tabla 4.7 y del recuento M-09), y la Figura 5 rotulaba el modelo como
zero-shot, que solo vale para la condición de ablación. El SVG se corrige
y el PNG se regenera con cairosvg, que reproduce el anterior al píxel.

Controles I1-I3 en verificar_coherencia.py: 46/46.
</commit_message>
<xml_diff>
--- a/docs/TESIS_FINAL_UTN_v6.docx
+++ b/docs/TESIS_FINAL_UTN_v6.docx
@@ -144,7 +144,7 @@
         <w:pStyle w:val="Ttulo1"/>
         <w:pageBreakBefore/>
       </w:pPr>
-      <w:bookmarkStart w:id="1" w:name="_Toc240302693"/>
+      <w:bookmarkStart w:id="1" w:name="_Toc240310326"/>
       <w:r>
         <w:lastRenderedPageBreak/>
         <w:t>DECLARACIÓN DE ORIGINALIDAD</w:t>
@@ -203,7 +203,7 @@
         <w:pStyle w:val="Ttulo1"/>
         <w:pageBreakBefore/>
       </w:pPr>
-      <w:bookmarkStart w:id="2" w:name="_Toc240302694"/>
+      <w:bookmarkStart w:id="2" w:name="_Toc240310327"/>
       <w:bookmarkEnd w:id="0"/>
       <w:r>
         <w:lastRenderedPageBreak/>
@@ -272,7 +272,7 @@
         <w:pStyle w:val="Ttulo1"/>
         <w:pageBreakBefore/>
       </w:pPr>
-      <w:bookmarkStart w:id="3" w:name="_Toc240302695"/>
+      <w:bookmarkStart w:id="3" w:name="_Toc240310328"/>
       <w:r>
         <w:lastRenderedPageBreak/>
         <w:t>ABSTRACT</w:t>
@@ -358,7 +358,7 @@
           <w:r>
             <w:fldChar w:fldCharType="separate"/>
           </w:r>
-          <w:hyperlink w:anchor="_Toc240302693" w:history="1">
+          <w:hyperlink w:anchor="_Toc240310326" w:history="1">
             <w:r>
               <w:rPr>
                 <w:rStyle w:val="Hipervnculo"/>
@@ -385,7 +385,7 @@
                 <w:noProof/>
                 <w:webHidden/>
               </w:rPr>
-              <w:instrText xml:space="preserve"> PAGEREF _Toc240302693 \h </w:instrText>
+              <w:instrText xml:space="preserve"> PAGEREF _Toc240310326 \h </w:instrText>
             </w:r>
             <w:r>
               <w:rPr>
@@ -429,7 +429,7 @@
               <w14:ligatures w14:val="standardContextual"/>
             </w:rPr>
           </w:pPr>
-          <w:hyperlink w:anchor="_Toc240302694" w:history="1">
+          <w:hyperlink w:anchor="_Toc240310327" w:history="1">
             <w:r>
               <w:rPr>
                 <w:rStyle w:val="Hipervnculo"/>
@@ -456,7 +456,7 @@
                 <w:noProof/>
                 <w:webHidden/>
               </w:rPr>
-              <w:instrText xml:space="preserve"> PAGEREF _Toc240302694 \h </w:instrText>
+              <w:instrText xml:space="preserve"> PAGEREF _Toc240310327 \h </w:instrText>
             </w:r>
             <w:r>
               <w:rPr>
@@ -500,7 +500,7 @@
               <w14:ligatures w14:val="standardContextual"/>
             </w:rPr>
           </w:pPr>
-          <w:hyperlink w:anchor="_Toc240302695" w:history="1">
+          <w:hyperlink w:anchor="_Toc240310328" w:history="1">
             <w:r>
               <w:rPr>
                 <w:rStyle w:val="Hipervnculo"/>
@@ -527,7 +527,7 @@
                 <w:noProof/>
                 <w:webHidden/>
               </w:rPr>
-              <w:instrText xml:space="preserve"> PAGEREF _Toc240302695 \h </w:instrText>
+              <w:instrText xml:space="preserve"> PAGEREF _Toc240310328 \h </w:instrText>
             </w:r>
             <w:r>
               <w:rPr>
@@ -571,7 +571,7 @@
               <w14:ligatures w14:val="standardContextual"/>
             </w:rPr>
           </w:pPr>
-          <w:hyperlink w:anchor="_Toc240302696" w:history="1">
+          <w:hyperlink w:anchor="_Toc240310329" w:history="1">
             <w:r>
               <w:rPr>
                 <w:rStyle w:val="Hipervnculo"/>
@@ -598,7 +598,7 @@
                 <w:noProof/>
                 <w:webHidden/>
               </w:rPr>
-              <w:instrText xml:space="preserve"> PAGEREF _Toc240302696 \h </w:instrText>
+              <w:instrText xml:space="preserve"> PAGEREF _Toc240310329 \h </w:instrText>
             </w:r>
             <w:r>
               <w:rPr>
@@ -642,7 +642,7 @@
               <w14:ligatures w14:val="standardContextual"/>
             </w:rPr>
           </w:pPr>
-          <w:hyperlink w:anchor="_Toc240302697" w:history="1">
+          <w:hyperlink w:anchor="_Toc240310330" w:history="1">
             <w:r>
               <w:rPr>
                 <w:rStyle w:val="Hipervnculo"/>
@@ -669,7 +669,7 @@
                 <w:noProof/>
                 <w:webHidden/>
               </w:rPr>
-              <w:instrText xml:space="preserve"> PAGEREF _Toc240302697 \h </w:instrText>
+              <w:instrText xml:space="preserve"> PAGEREF _Toc240310330 \h </w:instrText>
             </w:r>
             <w:r>
               <w:rPr>
@@ -713,7 +713,7 @@
               <w14:ligatures w14:val="standardContextual"/>
             </w:rPr>
           </w:pPr>
-          <w:hyperlink w:anchor="_Toc240302698" w:history="1">
+          <w:hyperlink w:anchor="_Toc240310331" w:history="1">
             <w:r>
               <w:rPr>
                 <w:rStyle w:val="Hipervnculo"/>
@@ -740,7 +740,7 @@
                 <w:noProof/>
                 <w:webHidden/>
               </w:rPr>
-              <w:instrText xml:space="preserve"> PAGEREF _Toc240302698 \h </w:instrText>
+              <w:instrText xml:space="preserve"> PAGEREF _Toc240310331 \h </w:instrText>
             </w:r>
             <w:r>
               <w:rPr>
@@ -784,7 +784,7 @@
               <w14:ligatures w14:val="standardContextual"/>
             </w:rPr>
           </w:pPr>
-          <w:hyperlink w:anchor="_Toc240302699" w:history="1">
+          <w:hyperlink w:anchor="_Toc240310332" w:history="1">
             <w:r>
               <w:rPr>
                 <w:rStyle w:val="Hipervnculo"/>
@@ -811,7 +811,7 @@
                 <w:noProof/>
                 <w:webHidden/>
               </w:rPr>
-              <w:instrText xml:space="preserve"> PAGEREF _Toc240302699 \h </w:instrText>
+              <w:instrText xml:space="preserve"> PAGEREF _Toc240310332 \h </w:instrText>
             </w:r>
             <w:r>
               <w:rPr>
@@ -855,7 +855,7 @@
               <w14:ligatures w14:val="standardContextual"/>
             </w:rPr>
           </w:pPr>
-          <w:hyperlink w:anchor="_Toc240302700" w:history="1">
+          <w:hyperlink w:anchor="_Toc240310333" w:history="1">
             <w:r>
               <w:rPr>
                 <w:rStyle w:val="Hipervnculo"/>
@@ -882,7 +882,7 @@
                 <w:noProof/>
                 <w:webHidden/>
               </w:rPr>
-              <w:instrText xml:space="preserve"> PAGEREF _Toc240302700 \h </w:instrText>
+              <w:instrText xml:space="preserve"> PAGEREF _Toc240310333 \h </w:instrText>
             </w:r>
             <w:r>
               <w:rPr>
@@ -926,7 +926,7 @@
               <w14:ligatures w14:val="standardContextual"/>
             </w:rPr>
           </w:pPr>
-          <w:hyperlink w:anchor="_Toc240302701" w:history="1">
+          <w:hyperlink w:anchor="_Toc240310334" w:history="1">
             <w:r>
               <w:rPr>
                 <w:rStyle w:val="Hipervnculo"/>
@@ -953,7 +953,7 @@
                 <w:noProof/>
                 <w:webHidden/>
               </w:rPr>
-              <w:instrText xml:space="preserve"> PAGEREF _Toc240302701 \h </w:instrText>
+              <w:instrText xml:space="preserve"> PAGEREF _Toc240310334 \h </w:instrText>
             </w:r>
             <w:r>
               <w:rPr>
@@ -997,7 +997,7 @@
               <w14:ligatures w14:val="standardContextual"/>
             </w:rPr>
           </w:pPr>
-          <w:hyperlink w:anchor="_Toc240302702" w:history="1">
+          <w:hyperlink w:anchor="_Toc240310335" w:history="1">
             <w:r>
               <w:rPr>
                 <w:rStyle w:val="Hipervnculo"/>
@@ -1024,7 +1024,7 @@
                 <w:noProof/>
                 <w:webHidden/>
               </w:rPr>
-              <w:instrText xml:space="preserve"> PAGEREF _Toc240302702 \h </w:instrText>
+              <w:instrText xml:space="preserve"> PAGEREF _Toc240310335 \h </w:instrText>
             </w:r>
             <w:r>
               <w:rPr>
@@ -1068,7 +1068,7 @@
               <w14:ligatures w14:val="standardContextual"/>
             </w:rPr>
           </w:pPr>
-          <w:hyperlink w:anchor="_Toc240302703" w:history="1">
+          <w:hyperlink w:anchor="_Toc240310336" w:history="1">
             <w:r>
               <w:rPr>
                 <w:rStyle w:val="Hipervnculo"/>
@@ -1095,7 +1095,7 @@
                 <w:noProof/>
                 <w:webHidden/>
               </w:rPr>
-              <w:instrText xml:space="preserve"> PAGEREF _Toc240302703 \h </w:instrText>
+              <w:instrText xml:space="preserve"> PAGEREF _Toc240310336 \h </w:instrText>
             </w:r>
             <w:r>
               <w:rPr>
@@ -1139,7 +1139,7 @@
               <w14:ligatures w14:val="standardContextual"/>
             </w:rPr>
           </w:pPr>
-          <w:hyperlink w:anchor="_Toc240302704" w:history="1">
+          <w:hyperlink w:anchor="_Toc240310337" w:history="1">
             <w:r>
               <w:rPr>
                 <w:rStyle w:val="Hipervnculo"/>
@@ -1166,7 +1166,7 @@
                 <w:noProof/>
                 <w:webHidden/>
               </w:rPr>
-              <w:instrText xml:space="preserve"> PAGEREF _Toc240302704 \h </w:instrText>
+              <w:instrText xml:space="preserve"> PAGEREF _Toc240310337 \h </w:instrText>
             </w:r>
             <w:r>
               <w:rPr>
@@ -1210,7 +1210,7 @@
               <w14:ligatures w14:val="standardContextual"/>
             </w:rPr>
           </w:pPr>
-          <w:hyperlink w:anchor="_Toc240302705" w:history="1">
+          <w:hyperlink w:anchor="_Toc240310338" w:history="1">
             <w:r>
               <w:rPr>
                 <w:rStyle w:val="Hipervnculo"/>
@@ -1237,7 +1237,7 @@
                 <w:noProof/>
                 <w:webHidden/>
               </w:rPr>
-              <w:instrText xml:space="preserve"> PAGEREF _Toc240302705 \h </w:instrText>
+              <w:instrText xml:space="preserve"> PAGEREF _Toc240310338 \h </w:instrText>
             </w:r>
             <w:r>
               <w:rPr>
@@ -1281,7 +1281,7 @@
               <w14:ligatures w14:val="standardContextual"/>
             </w:rPr>
           </w:pPr>
-          <w:hyperlink w:anchor="_Toc240302706" w:history="1">
+          <w:hyperlink w:anchor="_Toc240310339" w:history="1">
             <w:r>
               <w:rPr>
                 <w:rStyle w:val="Hipervnculo"/>
@@ -1308,7 +1308,7 @@
                 <w:noProof/>
                 <w:webHidden/>
               </w:rPr>
-              <w:instrText xml:space="preserve"> PAGEREF _Toc240302706 \h </w:instrText>
+              <w:instrText xml:space="preserve"> PAGEREF _Toc240310339 \h </w:instrText>
             </w:r>
             <w:r>
               <w:rPr>
@@ -1352,7 +1352,7 @@
               <w14:ligatures w14:val="standardContextual"/>
             </w:rPr>
           </w:pPr>
-          <w:hyperlink w:anchor="_Toc240302707" w:history="1">
+          <w:hyperlink w:anchor="_Toc240310340" w:history="1">
             <w:r>
               <w:rPr>
                 <w:rStyle w:val="Hipervnculo"/>
@@ -1379,7 +1379,7 @@
                 <w:noProof/>
                 <w:webHidden/>
               </w:rPr>
-              <w:instrText xml:space="preserve"> PAGEREF _Toc240302707 \h </w:instrText>
+              <w:instrText xml:space="preserve"> PAGEREF _Toc240310340 \h </w:instrText>
             </w:r>
             <w:r>
               <w:rPr>
@@ -1423,7 +1423,7 @@
               <w14:ligatures w14:val="standardContextual"/>
             </w:rPr>
           </w:pPr>
-          <w:hyperlink w:anchor="_Toc240302708" w:history="1">
+          <w:hyperlink w:anchor="_Toc240310341" w:history="1">
             <w:r>
               <w:rPr>
                 <w:rStyle w:val="Hipervnculo"/>
@@ -1450,7 +1450,7 @@
                 <w:noProof/>
                 <w:webHidden/>
               </w:rPr>
-              <w:instrText xml:space="preserve"> PAGEREF _Toc240302708 \h </w:instrText>
+              <w:instrText xml:space="preserve"> PAGEREF _Toc240310341 \h </w:instrText>
             </w:r>
             <w:r>
               <w:rPr>
@@ -1494,7 +1494,7 @@
               <w14:ligatures w14:val="standardContextual"/>
             </w:rPr>
           </w:pPr>
-          <w:hyperlink w:anchor="_Toc240302709" w:history="1">
+          <w:hyperlink w:anchor="_Toc240310342" w:history="1">
             <w:r>
               <w:rPr>
                 <w:rStyle w:val="Hipervnculo"/>
@@ -1521,7 +1521,7 @@
                 <w:noProof/>
                 <w:webHidden/>
               </w:rPr>
-              <w:instrText xml:space="preserve"> PAGEREF _Toc240302709 \h </w:instrText>
+              <w:instrText xml:space="preserve"> PAGEREF _Toc240310342 \h </w:instrText>
             </w:r>
             <w:r>
               <w:rPr>
@@ -1565,7 +1565,7 @@
               <w14:ligatures w14:val="standardContextual"/>
             </w:rPr>
           </w:pPr>
-          <w:hyperlink w:anchor="_Toc240302710" w:history="1">
+          <w:hyperlink w:anchor="_Toc240310343" w:history="1">
             <w:r>
               <w:rPr>
                 <w:rStyle w:val="Hipervnculo"/>
@@ -1592,7 +1592,7 @@
                 <w:noProof/>
                 <w:webHidden/>
               </w:rPr>
-              <w:instrText xml:space="preserve"> PAGEREF _Toc240302710 \h </w:instrText>
+              <w:instrText xml:space="preserve"> PAGEREF _Toc240310343 \h </w:instrText>
             </w:r>
             <w:r>
               <w:rPr>
@@ -1636,7 +1636,7 @@
               <w14:ligatures w14:val="standardContextual"/>
             </w:rPr>
           </w:pPr>
-          <w:hyperlink w:anchor="_Toc240302711" w:history="1">
+          <w:hyperlink w:anchor="_Toc240310344" w:history="1">
             <w:r>
               <w:rPr>
                 <w:rStyle w:val="Hipervnculo"/>
@@ -1663,7 +1663,7 @@
                 <w:noProof/>
                 <w:webHidden/>
               </w:rPr>
-              <w:instrText xml:space="preserve"> PAGEREF _Toc240302711 \h </w:instrText>
+              <w:instrText xml:space="preserve"> PAGEREF _Toc240310344 \h </w:instrText>
             </w:r>
             <w:r>
               <w:rPr>
@@ -1707,7 +1707,7 @@
               <w14:ligatures w14:val="standardContextual"/>
             </w:rPr>
           </w:pPr>
-          <w:hyperlink w:anchor="_Toc240302712" w:history="1">
+          <w:hyperlink w:anchor="_Toc240310345" w:history="1">
             <w:r>
               <w:rPr>
                 <w:rStyle w:val="Hipervnculo"/>
@@ -1734,7 +1734,7 @@
                 <w:noProof/>
                 <w:webHidden/>
               </w:rPr>
-              <w:instrText xml:space="preserve"> PAGEREF _Toc240302712 \h </w:instrText>
+              <w:instrText xml:space="preserve"> PAGEREF _Toc240310345 \h </w:instrText>
             </w:r>
             <w:r>
               <w:rPr>
@@ -1778,7 +1778,7 @@
               <w14:ligatures w14:val="standardContextual"/>
             </w:rPr>
           </w:pPr>
-          <w:hyperlink w:anchor="_Toc240302713" w:history="1">
+          <w:hyperlink w:anchor="_Toc240310346" w:history="1">
             <w:r>
               <w:rPr>
                 <w:rStyle w:val="Hipervnculo"/>
@@ -1805,7 +1805,7 @@
                 <w:noProof/>
                 <w:webHidden/>
               </w:rPr>
-              <w:instrText xml:space="preserve"> PAGEREF _Toc240302713 \h </w:instrText>
+              <w:instrText xml:space="preserve"> PAGEREF _Toc240310346 \h </w:instrText>
             </w:r>
             <w:r>
               <w:rPr>
@@ -1849,7 +1849,7 @@
               <w14:ligatures w14:val="standardContextual"/>
             </w:rPr>
           </w:pPr>
-          <w:hyperlink w:anchor="_Toc240302714" w:history="1">
+          <w:hyperlink w:anchor="_Toc240310347" w:history="1">
             <w:r>
               <w:rPr>
                 <w:rStyle w:val="Hipervnculo"/>
@@ -1876,7 +1876,7 @@
                 <w:noProof/>
                 <w:webHidden/>
               </w:rPr>
-              <w:instrText xml:space="preserve"> PAGEREF _Toc240302714 \h </w:instrText>
+              <w:instrText xml:space="preserve"> PAGEREF _Toc240310347 \h </w:instrText>
             </w:r>
             <w:r>
               <w:rPr>
@@ -1920,7 +1920,7 @@
               <w14:ligatures w14:val="standardContextual"/>
             </w:rPr>
           </w:pPr>
-          <w:hyperlink w:anchor="_Toc240302715" w:history="1">
+          <w:hyperlink w:anchor="_Toc240310348" w:history="1">
             <w:r>
               <w:rPr>
                 <w:rStyle w:val="Hipervnculo"/>
@@ -1947,7 +1947,7 @@
                 <w:noProof/>
                 <w:webHidden/>
               </w:rPr>
-              <w:instrText xml:space="preserve"> PAGEREF _Toc240302715 \h </w:instrText>
+              <w:instrText xml:space="preserve"> PAGEREF _Toc240310348 \h </w:instrText>
             </w:r>
             <w:r>
               <w:rPr>
@@ -1991,7 +1991,7 @@
               <w14:ligatures w14:val="standardContextual"/>
             </w:rPr>
           </w:pPr>
-          <w:hyperlink w:anchor="_Toc240302716" w:history="1">
+          <w:hyperlink w:anchor="_Toc240310349" w:history="1">
             <w:r>
               <w:rPr>
                 <w:rStyle w:val="Hipervnculo"/>
@@ -2018,7 +2018,7 @@
                 <w:noProof/>
                 <w:webHidden/>
               </w:rPr>
-              <w:instrText xml:space="preserve"> PAGEREF _Toc240302716 \h </w:instrText>
+              <w:instrText xml:space="preserve"> PAGEREF _Toc240310349 \h </w:instrText>
             </w:r>
             <w:r>
               <w:rPr>
@@ -2062,7 +2062,7 @@
               <w14:ligatures w14:val="standardContextual"/>
             </w:rPr>
           </w:pPr>
-          <w:hyperlink w:anchor="_Toc240302717" w:history="1">
+          <w:hyperlink w:anchor="_Toc240310350" w:history="1">
             <w:r>
               <w:rPr>
                 <w:rStyle w:val="Hipervnculo"/>
@@ -2089,7 +2089,7 @@
                 <w:noProof/>
                 <w:webHidden/>
               </w:rPr>
-              <w:instrText xml:space="preserve"> PAGEREF _Toc240302717 \h </w:instrText>
+              <w:instrText xml:space="preserve"> PAGEREF _Toc240310350 \h </w:instrText>
             </w:r>
             <w:r>
               <w:rPr>
@@ -2133,7 +2133,7 @@
               <w14:ligatures w14:val="standardContextual"/>
             </w:rPr>
           </w:pPr>
-          <w:hyperlink w:anchor="_Toc240302718" w:history="1">
+          <w:hyperlink w:anchor="_Toc240310351" w:history="1">
             <w:r>
               <w:rPr>
                 <w:rStyle w:val="Hipervnculo"/>
@@ -2160,7 +2160,7 @@
                 <w:noProof/>
                 <w:webHidden/>
               </w:rPr>
-              <w:instrText xml:space="preserve"> PAGEREF _Toc240302718 \h </w:instrText>
+              <w:instrText xml:space="preserve"> PAGEREF _Toc240310351 \h </w:instrText>
             </w:r>
             <w:r>
               <w:rPr>
@@ -2204,7 +2204,7 @@
               <w14:ligatures w14:val="standardContextual"/>
             </w:rPr>
           </w:pPr>
-          <w:hyperlink w:anchor="_Toc240302719" w:history="1">
+          <w:hyperlink w:anchor="_Toc240310352" w:history="1">
             <w:r>
               <w:rPr>
                 <w:rStyle w:val="Hipervnculo"/>
@@ -2231,7 +2231,7 @@
                 <w:noProof/>
                 <w:webHidden/>
               </w:rPr>
-              <w:instrText xml:space="preserve"> PAGEREF _Toc240302719 \h </w:instrText>
+              <w:instrText xml:space="preserve"> PAGEREF _Toc240310352 \h </w:instrText>
             </w:r>
             <w:r>
               <w:rPr>
@@ -2275,7 +2275,7 @@
               <w14:ligatures w14:val="standardContextual"/>
             </w:rPr>
           </w:pPr>
-          <w:hyperlink w:anchor="_Toc240302720" w:history="1">
+          <w:hyperlink w:anchor="_Toc240310353" w:history="1">
             <w:r>
               <w:rPr>
                 <w:rStyle w:val="Hipervnculo"/>
@@ -2302,7 +2302,7 @@
                 <w:noProof/>
                 <w:webHidden/>
               </w:rPr>
-              <w:instrText xml:space="preserve"> PAGEREF _Toc240302720 \h </w:instrText>
+              <w:instrText xml:space="preserve"> PAGEREF _Toc240310353 \h </w:instrText>
             </w:r>
             <w:r>
               <w:rPr>
@@ -2346,7 +2346,7 @@
               <w14:ligatures w14:val="standardContextual"/>
             </w:rPr>
           </w:pPr>
-          <w:hyperlink w:anchor="_Toc240302721" w:history="1">
+          <w:hyperlink w:anchor="_Toc240310354" w:history="1">
             <w:r>
               <w:rPr>
                 <w:rStyle w:val="Hipervnculo"/>
@@ -2373,7 +2373,7 @@
                 <w:noProof/>
                 <w:webHidden/>
               </w:rPr>
-              <w:instrText xml:space="preserve"> PAGEREF _Toc240302721 \h </w:instrText>
+              <w:instrText xml:space="preserve"> PAGEREF _Toc240310354 \h </w:instrText>
             </w:r>
             <w:r>
               <w:rPr>
@@ -2417,7 +2417,7 @@
               <w14:ligatures w14:val="standardContextual"/>
             </w:rPr>
           </w:pPr>
-          <w:hyperlink w:anchor="_Toc240302722" w:history="1">
+          <w:hyperlink w:anchor="_Toc240310355" w:history="1">
             <w:r>
               <w:rPr>
                 <w:rStyle w:val="Hipervnculo"/>
@@ -2444,7 +2444,7 @@
                 <w:noProof/>
                 <w:webHidden/>
               </w:rPr>
-              <w:instrText xml:space="preserve"> PAGEREF _Toc240302722 \h </w:instrText>
+              <w:instrText xml:space="preserve"> PAGEREF _Toc240310355 \h </w:instrText>
             </w:r>
             <w:r>
               <w:rPr>
@@ -2488,7 +2488,7 @@
               <w14:ligatures w14:val="standardContextual"/>
             </w:rPr>
           </w:pPr>
-          <w:hyperlink w:anchor="_Toc240302723" w:history="1">
+          <w:hyperlink w:anchor="_Toc240310356" w:history="1">
             <w:r>
               <w:rPr>
                 <w:rStyle w:val="Hipervnculo"/>
@@ -2515,7 +2515,7 @@
                 <w:noProof/>
                 <w:webHidden/>
               </w:rPr>
-              <w:instrText xml:space="preserve"> PAGEREF _Toc240302723 \h </w:instrText>
+              <w:instrText xml:space="preserve"> PAGEREF _Toc240310356 \h </w:instrText>
             </w:r>
             <w:r>
               <w:rPr>
@@ -2559,7 +2559,7 @@
               <w14:ligatures w14:val="standardContextual"/>
             </w:rPr>
           </w:pPr>
-          <w:hyperlink w:anchor="_Toc240302724" w:history="1">
+          <w:hyperlink w:anchor="_Toc240310357" w:history="1">
             <w:r>
               <w:rPr>
                 <w:rStyle w:val="Hipervnculo"/>
@@ -2586,7 +2586,7 @@
                 <w:noProof/>
                 <w:webHidden/>
               </w:rPr>
-              <w:instrText xml:space="preserve"> PAGEREF _Toc240302724 \h </w:instrText>
+              <w:instrText xml:space="preserve"> PAGEREF _Toc240310357 \h </w:instrText>
             </w:r>
             <w:r>
               <w:rPr>
@@ -2630,7 +2630,7 @@
               <w14:ligatures w14:val="standardContextual"/>
             </w:rPr>
           </w:pPr>
-          <w:hyperlink w:anchor="_Toc240302725" w:history="1">
+          <w:hyperlink w:anchor="_Toc240310358" w:history="1">
             <w:r>
               <w:rPr>
                 <w:rStyle w:val="Hipervnculo"/>
@@ -2657,7 +2657,7 @@
                 <w:noProof/>
                 <w:webHidden/>
               </w:rPr>
-              <w:instrText xml:space="preserve"> PAGEREF _Toc240302725 \h </w:instrText>
+              <w:instrText xml:space="preserve"> PAGEREF _Toc240310358 \h </w:instrText>
             </w:r>
             <w:r>
               <w:rPr>
@@ -2701,7 +2701,7 @@
               <w14:ligatures w14:val="standardContextual"/>
             </w:rPr>
           </w:pPr>
-          <w:hyperlink w:anchor="_Toc240302726" w:history="1">
+          <w:hyperlink w:anchor="_Toc240310359" w:history="1">
             <w:r>
               <w:rPr>
                 <w:rStyle w:val="Hipervnculo"/>
@@ -2728,7 +2728,7 @@
                 <w:noProof/>
                 <w:webHidden/>
               </w:rPr>
-              <w:instrText xml:space="preserve"> PAGEREF _Toc240302726 \h </w:instrText>
+              <w:instrText xml:space="preserve"> PAGEREF _Toc240310359 \h </w:instrText>
             </w:r>
             <w:r>
               <w:rPr>
@@ -2772,7 +2772,7 @@
               <w14:ligatures w14:val="standardContextual"/>
             </w:rPr>
           </w:pPr>
-          <w:hyperlink w:anchor="_Toc240302727" w:history="1">
+          <w:hyperlink w:anchor="_Toc240310360" w:history="1">
             <w:r>
               <w:rPr>
                 <w:rStyle w:val="Hipervnculo"/>
@@ -2799,7 +2799,7 @@
                 <w:noProof/>
                 <w:webHidden/>
               </w:rPr>
-              <w:instrText xml:space="preserve"> PAGEREF _Toc240302727 \h </w:instrText>
+              <w:instrText xml:space="preserve"> PAGEREF _Toc240310360 \h </w:instrText>
             </w:r>
             <w:r>
               <w:rPr>
@@ -2843,7 +2843,7 @@
               <w14:ligatures w14:val="standardContextual"/>
             </w:rPr>
           </w:pPr>
-          <w:hyperlink w:anchor="_Toc240302728" w:history="1">
+          <w:hyperlink w:anchor="_Toc240310361" w:history="1">
             <w:r>
               <w:rPr>
                 <w:rStyle w:val="Hipervnculo"/>
@@ -2870,7 +2870,7 @@
                 <w:noProof/>
                 <w:webHidden/>
               </w:rPr>
-              <w:instrText xml:space="preserve"> PAGEREF _Toc240302728 \h </w:instrText>
+              <w:instrText xml:space="preserve"> PAGEREF _Toc240310361 \h </w:instrText>
             </w:r>
             <w:r>
               <w:rPr>
@@ -2914,7 +2914,7 @@
               <w14:ligatures w14:val="standardContextual"/>
             </w:rPr>
           </w:pPr>
-          <w:hyperlink w:anchor="_Toc240302729" w:history="1">
+          <w:hyperlink w:anchor="_Toc240310362" w:history="1">
             <w:r>
               <w:rPr>
                 <w:rStyle w:val="Hipervnculo"/>
@@ -2941,7 +2941,7 @@
                 <w:noProof/>
                 <w:webHidden/>
               </w:rPr>
-              <w:instrText xml:space="preserve"> PAGEREF _Toc240302729 \h </w:instrText>
+              <w:instrText xml:space="preserve"> PAGEREF _Toc240310362 \h </w:instrText>
             </w:r>
             <w:r>
               <w:rPr>
@@ -2985,7 +2985,7 @@
               <w14:ligatures w14:val="standardContextual"/>
             </w:rPr>
           </w:pPr>
-          <w:hyperlink w:anchor="_Toc240302730" w:history="1">
+          <w:hyperlink w:anchor="_Toc240310363" w:history="1">
             <w:r>
               <w:rPr>
                 <w:rStyle w:val="Hipervnculo"/>
@@ -3012,7 +3012,7 @@
                 <w:noProof/>
                 <w:webHidden/>
               </w:rPr>
-              <w:instrText xml:space="preserve"> PAGEREF _Toc240302730 \h </w:instrText>
+              <w:instrText xml:space="preserve"> PAGEREF _Toc240310363 \h </w:instrText>
             </w:r>
             <w:r>
               <w:rPr>
@@ -3056,7 +3056,7 @@
               <w14:ligatures w14:val="standardContextual"/>
             </w:rPr>
           </w:pPr>
-          <w:hyperlink w:anchor="_Toc240302731" w:history="1">
+          <w:hyperlink w:anchor="_Toc240310364" w:history="1">
             <w:r>
               <w:rPr>
                 <w:rStyle w:val="Hipervnculo"/>
@@ -3083,7 +3083,7 @@
                 <w:noProof/>
                 <w:webHidden/>
               </w:rPr>
-              <w:instrText xml:space="preserve"> PAGEREF _Toc240302731 \h </w:instrText>
+              <w:instrText xml:space="preserve"> PAGEREF _Toc240310364 \h </w:instrText>
             </w:r>
             <w:r>
               <w:rPr>
@@ -3127,7 +3127,7 @@
               <w14:ligatures w14:val="standardContextual"/>
             </w:rPr>
           </w:pPr>
-          <w:hyperlink w:anchor="_Toc240302732" w:history="1">
+          <w:hyperlink w:anchor="_Toc240310365" w:history="1">
             <w:r>
               <w:rPr>
                 <w:rStyle w:val="Hipervnculo"/>
@@ -3154,7 +3154,7 @@
                 <w:noProof/>
                 <w:webHidden/>
               </w:rPr>
-              <w:instrText xml:space="preserve"> PAGEREF _Toc240302732 \h </w:instrText>
+              <w:instrText xml:space="preserve"> PAGEREF _Toc240310365 \h </w:instrText>
             </w:r>
             <w:r>
               <w:rPr>
@@ -3198,7 +3198,7 @@
               <w14:ligatures w14:val="standardContextual"/>
             </w:rPr>
           </w:pPr>
-          <w:hyperlink w:anchor="_Toc240302733" w:history="1">
+          <w:hyperlink w:anchor="_Toc240310366" w:history="1">
             <w:r>
               <w:rPr>
                 <w:rStyle w:val="Hipervnculo"/>
@@ -3225,7 +3225,7 @@
                 <w:noProof/>
                 <w:webHidden/>
               </w:rPr>
-              <w:instrText xml:space="preserve"> PAGEREF _Toc240302733 \h </w:instrText>
+              <w:instrText xml:space="preserve"> PAGEREF _Toc240310366 \h </w:instrText>
             </w:r>
             <w:r>
               <w:rPr>
@@ -3269,7 +3269,7 @@
               <w14:ligatures w14:val="standardContextual"/>
             </w:rPr>
           </w:pPr>
-          <w:hyperlink w:anchor="_Toc240302734" w:history="1">
+          <w:hyperlink w:anchor="_Toc240310367" w:history="1">
             <w:r>
               <w:rPr>
                 <w:rStyle w:val="Hipervnculo"/>
@@ -3296,7 +3296,7 @@
                 <w:noProof/>
                 <w:webHidden/>
               </w:rPr>
-              <w:instrText xml:space="preserve"> PAGEREF _Toc240302734 \h </w:instrText>
+              <w:instrText xml:space="preserve"> PAGEREF _Toc240310367 \h </w:instrText>
             </w:r>
             <w:r>
               <w:rPr>
@@ -3340,7 +3340,7 @@
               <w14:ligatures w14:val="standardContextual"/>
             </w:rPr>
           </w:pPr>
-          <w:hyperlink w:anchor="_Toc240302735" w:history="1">
+          <w:hyperlink w:anchor="_Toc240310368" w:history="1">
             <w:r>
               <w:rPr>
                 <w:rStyle w:val="Hipervnculo"/>
@@ -3367,7 +3367,7 @@
                 <w:noProof/>
                 <w:webHidden/>
               </w:rPr>
-              <w:instrText xml:space="preserve"> PAGEREF _Toc240302735 \h </w:instrText>
+              <w:instrText xml:space="preserve"> PAGEREF _Toc240310368 \h </w:instrText>
             </w:r>
             <w:r>
               <w:rPr>
@@ -3411,7 +3411,7 @@
               <w14:ligatures w14:val="standardContextual"/>
             </w:rPr>
           </w:pPr>
-          <w:hyperlink w:anchor="_Toc240302736" w:history="1">
+          <w:hyperlink w:anchor="_Toc240310369" w:history="1">
             <w:r>
               <w:rPr>
                 <w:rStyle w:val="Hipervnculo"/>
@@ -3438,7 +3438,7 @@
                 <w:noProof/>
                 <w:webHidden/>
               </w:rPr>
-              <w:instrText xml:space="preserve"> PAGEREF _Toc240302736 \h </w:instrText>
+              <w:instrText xml:space="preserve"> PAGEREF _Toc240310369 \h </w:instrText>
             </w:r>
             <w:r>
               <w:rPr>
@@ -3482,7 +3482,7 @@
               <w14:ligatures w14:val="standardContextual"/>
             </w:rPr>
           </w:pPr>
-          <w:hyperlink w:anchor="_Toc240302737" w:history="1">
+          <w:hyperlink w:anchor="_Toc240310370" w:history="1">
             <w:r>
               <w:rPr>
                 <w:rStyle w:val="Hipervnculo"/>
@@ -3509,7 +3509,7 @@
                 <w:noProof/>
                 <w:webHidden/>
               </w:rPr>
-              <w:instrText xml:space="preserve"> PAGEREF _Toc240302737 \h </w:instrText>
+              <w:instrText xml:space="preserve"> PAGEREF _Toc240310370 \h </w:instrText>
             </w:r>
             <w:r>
               <w:rPr>
@@ -3553,7 +3553,7 @@
               <w14:ligatures w14:val="standardContextual"/>
             </w:rPr>
           </w:pPr>
-          <w:hyperlink w:anchor="_Toc240302738" w:history="1">
+          <w:hyperlink w:anchor="_Toc240310371" w:history="1">
             <w:r>
               <w:rPr>
                 <w:rStyle w:val="Hipervnculo"/>
@@ -3580,7 +3580,7 @@
                 <w:noProof/>
                 <w:webHidden/>
               </w:rPr>
-              <w:instrText xml:space="preserve"> PAGEREF _Toc240302738 \h </w:instrText>
+              <w:instrText xml:space="preserve"> PAGEREF _Toc240310371 \h </w:instrText>
             </w:r>
             <w:r>
               <w:rPr>
@@ -3624,7 +3624,7 @@
               <w14:ligatures w14:val="standardContextual"/>
             </w:rPr>
           </w:pPr>
-          <w:hyperlink w:anchor="_Toc240302739" w:history="1">
+          <w:hyperlink w:anchor="_Toc240310372" w:history="1">
             <w:r>
               <w:rPr>
                 <w:rStyle w:val="Hipervnculo"/>
@@ -3651,7 +3651,7 @@
                 <w:noProof/>
                 <w:webHidden/>
               </w:rPr>
-              <w:instrText xml:space="preserve"> PAGEREF _Toc240302739 \h </w:instrText>
+              <w:instrText xml:space="preserve"> PAGEREF _Toc240310372 \h </w:instrText>
             </w:r>
             <w:r>
               <w:rPr>
@@ -3695,7 +3695,7 @@
               <w14:ligatures w14:val="standardContextual"/>
             </w:rPr>
           </w:pPr>
-          <w:hyperlink w:anchor="_Toc240302740" w:history="1">
+          <w:hyperlink w:anchor="_Toc240310373" w:history="1">
             <w:r>
               <w:rPr>
                 <w:rStyle w:val="Hipervnculo"/>
@@ -3722,7 +3722,7 @@
                 <w:noProof/>
                 <w:webHidden/>
               </w:rPr>
-              <w:instrText xml:space="preserve"> PAGEREF _Toc240302740 \h </w:instrText>
+              <w:instrText xml:space="preserve"> PAGEREF _Toc240310373 \h </w:instrText>
             </w:r>
             <w:r>
               <w:rPr>
@@ -3766,7 +3766,7 @@
               <w14:ligatures w14:val="standardContextual"/>
             </w:rPr>
           </w:pPr>
-          <w:hyperlink w:anchor="_Toc240302741" w:history="1">
+          <w:hyperlink w:anchor="_Toc240310374" w:history="1">
             <w:r>
               <w:rPr>
                 <w:rStyle w:val="Hipervnculo"/>
@@ -3793,7 +3793,7 @@
                 <w:noProof/>
                 <w:webHidden/>
               </w:rPr>
-              <w:instrText xml:space="preserve"> PAGEREF _Toc240302741 \h </w:instrText>
+              <w:instrText xml:space="preserve"> PAGEREF _Toc240310374 \h </w:instrText>
             </w:r>
             <w:r>
               <w:rPr>
@@ -3837,7 +3837,7 @@
               <w14:ligatures w14:val="standardContextual"/>
             </w:rPr>
           </w:pPr>
-          <w:hyperlink w:anchor="_Toc240302742" w:history="1">
+          <w:hyperlink w:anchor="_Toc240310375" w:history="1">
             <w:r>
               <w:rPr>
                 <w:rStyle w:val="Hipervnculo"/>
@@ -3864,7 +3864,7 @@
                 <w:noProof/>
                 <w:webHidden/>
               </w:rPr>
-              <w:instrText xml:space="preserve"> PAGEREF _Toc240302742 \h </w:instrText>
+              <w:instrText xml:space="preserve"> PAGEREF _Toc240310375 \h </w:instrText>
             </w:r>
             <w:r>
               <w:rPr>
@@ -3908,7 +3908,7 @@
               <w14:ligatures w14:val="standardContextual"/>
             </w:rPr>
           </w:pPr>
-          <w:hyperlink w:anchor="_Toc240302743" w:history="1">
+          <w:hyperlink w:anchor="_Toc240310376" w:history="1">
             <w:r>
               <w:rPr>
                 <w:rStyle w:val="Hipervnculo"/>
@@ -3935,7 +3935,7 @@
                 <w:noProof/>
                 <w:webHidden/>
               </w:rPr>
-              <w:instrText xml:space="preserve"> PAGEREF _Toc240302743 \h </w:instrText>
+              <w:instrText xml:space="preserve"> PAGEREF _Toc240310376 \h </w:instrText>
             </w:r>
             <w:r>
               <w:rPr>
@@ -3979,7 +3979,7 @@
               <w14:ligatures w14:val="standardContextual"/>
             </w:rPr>
           </w:pPr>
-          <w:hyperlink w:anchor="_Toc240302744" w:history="1">
+          <w:hyperlink w:anchor="_Toc240310377" w:history="1">
             <w:r>
               <w:rPr>
                 <w:rStyle w:val="Hipervnculo"/>
@@ -4006,7 +4006,7 @@
                 <w:noProof/>
                 <w:webHidden/>
               </w:rPr>
-              <w:instrText xml:space="preserve"> PAGEREF _Toc240302744 \h </w:instrText>
+              <w:instrText xml:space="preserve"> PAGEREF _Toc240310377 \h </w:instrText>
             </w:r>
             <w:r>
               <w:rPr>
@@ -4050,7 +4050,7 @@
               <w14:ligatures w14:val="standardContextual"/>
             </w:rPr>
           </w:pPr>
-          <w:hyperlink w:anchor="_Toc240302745" w:history="1">
+          <w:hyperlink w:anchor="_Toc240310378" w:history="1">
             <w:r>
               <w:rPr>
                 <w:rStyle w:val="Hipervnculo"/>
@@ -4077,7 +4077,7 @@
                 <w:noProof/>
                 <w:webHidden/>
               </w:rPr>
-              <w:instrText xml:space="preserve"> PAGEREF _Toc240302745 \h </w:instrText>
+              <w:instrText xml:space="preserve"> PAGEREF _Toc240310378 \h </w:instrText>
             </w:r>
             <w:r>
               <w:rPr>
@@ -4121,7 +4121,7 @@
               <w14:ligatures w14:val="standardContextual"/>
             </w:rPr>
           </w:pPr>
-          <w:hyperlink w:anchor="_Toc240302746" w:history="1">
+          <w:hyperlink w:anchor="_Toc240310379" w:history="1">
             <w:r>
               <w:rPr>
                 <w:rStyle w:val="Hipervnculo"/>
@@ -4148,7 +4148,7 @@
                 <w:noProof/>
                 <w:webHidden/>
               </w:rPr>
-              <w:instrText xml:space="preserve"> PAGEREF _Toc240302746 \h </w:instrText>
+              <w:instrText xml:space="preserve"> PAGEREF _Toc240310379 \h </w:instrText>
             </w:r>
             <w:r>
               <w:rPr>
@@ -4192,7 +4192,7 @@
               <w14:ligatures w14:val="standardContextual"/>
             </w:rPr>
           </w:pPr>
-          <w:hyperlink w:anchor="_Toc240302747" w:history="1">
+          <w:hyperlink w:anchor="_Toc240310380" w:history="1">
             <w:r>
               <w:rPr>
                 <w:rStyle w:val="Hipervnculo"/>
@@ -4219,7 +4219,7 @@
                 <w:noProof/>
                 <w:webHidden/>
               </w:rPr>
-              <w:instrText xml:space="preserve"> PAGEREF _Toc240302747 \h </w:instrText>
+              <w:instrText xml:space="preserve"> PAGEREF _Toc240310380 \h </w:instrText>
             </w:r>
             <w:r>
               <w:rPr>
@@ -4263,7 +4263,7 @@
               <w14:ligatures w14:val="standardContextual"/>
             </w:rPr>
           </w:pPr>
-          <w:hyperlink w:anchor="_Toc240302748" w:history="1">
+          <w:hyperlink w:anchor="_Toc240310381" w:history="1">
             <w:r>
               <w:rPr>
                 <w:rStyle w:val="Hipervnculo"/>
@@ -4290,7 +4290,7 @@
                 <w:noProof/>
                 <w:webHidden/>
               </w:rPr>
-              <w:instrText xml:space="preserve"> PAGEREF _Toc240302748 \h </w:instrText>
+              <w:instrText xml:space="preserve"> PAGEREF _Toc240310381 \h </w:instrText>
             </w:r>
             <w:r>
               <w:rPr>
@@ -4334,7 +4334,7 @@
               <w14:ligatures w14:val="standardContextual"/>
             </w:rPr>
           </w:pPr>
-          <w:hyperlink w:anchor="_Toc240302749" w:history="1">
+          <w:hyperlink w:anchor="_Toc240310382" w:history="1">
             <w:r>
               <w:rPr>
                 <w:rStyle w:val="Hipervnculo"/>
@@ -4361,7 +4361,7 @@
                 <w:noProof/>
                 <w:webHidden/>
               </w:rPr>
-              <w:instrText xml:space="preserve"> PAGEREF _Toc240302749 \h </w:instrText>
+              <w:instrText xml:space="preserve"> PAGEREF _Toc240310382 \h </w:instrText>
             </w:r>
             <w:r>
               <w:rPr>
@@ -4405,7 +4405,7 @@
               <w14:ligatures w14:val="standardContextual"/>
             </w:rPr>
           </w:pPr>
-          <w:hyperlink w:anchor="_Toc240302750" w:history="1">
+          <w:hyperlink w:anchor="_Toc240310383" w:history="1">
             <w:r>
               <w:rPr>
                 <w:rStyle w:val="Hipervnculo"/>
@@ -4432,7 +4432,7 @@
                 <w:noProof/>
                 <w:webHidden/>
               </w:rPr>
-              <w:instrText xml:space="preserve"> PAGEREF _Toc240302750 \h </w:instrText>
+              <w:instrText xml:space="preserve"> PAGEREF _Toc240310383 \h </w:instrText>
             </w:r>
             <w:r>
               <w:rPr>
@@ -4476,7 +4476,7 @@
               <w14:ligatures w14:val="standardContextual"/>
             </w:rPr>
           </w:pPr>
-          <w:hyperlink w:anchor="_Toc240302751" w:history="1">
+          <w:hyperlink w:anchor="_Toc240310384" w:history="1">
             <w:r>
               <w:rPr>
                 <w:rStyle w:val="Hipervnculo"/>
@@ -4503,7 +4503,7 @@
                 <w:noProof/>
                 <w:webHidden/>
               </w:rPr>
-              <w:instrText xml:space="preserve"> PAGEREF _Toc240302751 \h </w:instrText>
+              <w:instrText xml:space="preserve"> PAGEREF _Toc240310384 \h </w:instrText>
             </w:r>
             <w:r>
               <w:rPr>
@@ -4547,7 +4547,7 @@
               <w14:ligatures w14:val="standardContextual"/>
             </w:rPr>
           </w:pPr>
-          <w:hyperlink w:anchor="_Toc240302752" w:history="1">
+          <w:hyperlink w:anchor="_Toc240310385" w:history="1">
             <w:r>
               <w:rPr>
                 <w:rStyle w:val="Hipervnculo"/>
@@ -4574,7 +4574,7 @@
                 <w:noProof/>
                 <w:webHidden/>
               </w:rPr>
-              <w:instrText xml:space="preserve"> PAGEREF _Toc240302752 \h </w:instrText>
+              <w:instrText xml:space="preserve"> PAGEREF _Toc240310385 \h </w:instrText>
             </w:r>
             <w:r>
               <w:rPr>
@@ -4618,7 +4618,7 @@
               <w14:ligatures w14:val="standardContextual"/>
             </w:rPr>
           </w:pPr>
-          <w:hyperlink w:anchor="_Toc240302753" w:history="1">
+          <w:hyperlink w:anchor="_Toc240310386" w:history="1">
             <w:r>
               <w:rPr>
                 <w:rStyle w:val="Hipervnculo"/>
@@ -4645,7 +4645,7 @@
                 <w:noProof/>
                 <w:webHidden/>
               </w:rPr>
-              <w:instrText xml:space="preserve"> PAGEREF _Toc240302753 \h </w:instrText>
+              <w:instrText xml:space="preserve"> PAGEREF _Toc240310386 \h </w:instrText>
             </w:r>
             <w:r>
               <w:rPr>
@@ -4689,7 +4689,7 @@
               <w14:ligatures w14:val="standardContextual"/>
             </w:rPr>
           </w:pPr>
-          <w:hyperlink w:anchor="_Toc240302754" w:history="1">
+          <w:hyperlink w:anchor="_Toc240310387" w:history="1">
             <w:r>
               <w:rPr>
                 <w:rStyle w:val="Hipervnculo"/>
@@ -4716,7 +4716,7 @@
                 <w:noProof/>
                 <w:webHidden/>
               </w:rPr>
-              <w:instrText xml:space="preserve"> PAGEREF _Toc240302754 \h </w:instrText>
+              <w:instrText xml:space="preserve"> PAGEREF _Toc240310387 \h </w:instrText>
             </w:r>
             <w:r>
               <w:rPr>
@@ -4760,7 +4760,7 @@
               <w14:ligatures w14:val="standardContextual"/>
             </w:rPr>
           </w:pPr>
-          <w:hyperlink w:anchor="_Toc240302755" w:history="1">
+          <w:hyperlink w:anchor="_Toc240310388" w:history="1">
             <w:r>
               <w:rPr>
                 <w:rStyle w:val="Hipervnculo"/>
@@ -4787,7 +4787,7 @@
                 <w:noProof/>
                 <w:webHidden/>
               </w:rPr>
-              <w:instrText xml:space="preserve"> PAGEREF _Toc240302755 \h </w:instrText>
+              <w:instrText xml:space="preserve"> PAGEREF _Toc240310388 \h </w:instrText>
             </w:r>
             <w:r>
               <w:rPr>
@@ -4831,7 +4831,7 @@
               <w14:ligatures w14:val="standardContextual"/>
             </w:rPr>
           </w:pPr>
-          <w:hyperlink w:anchor="_Toc240302756" w:history="1">
+          <w:hyperlink w:anchor="_Toc240310389" w:history="1">
             <w:r>
               <w:rPr>
                 <w:rStyle w:val="Hipervnculo"/>
@@ -4858,7 +4858,7 @@
                 <w:noProof/>
                 <w:webHidden/>
               </w:rPr>
-              <w:instrText xml:space="preserve"> PAGEREF _Toc240302756 \h </w:instrText>
+              <w:instrText xml:space="preserve"> PAGEREF _Toc240310389 \h </w:instrText>
             </w:r>
             <w:r>
               <w:rPr>
@@ -4902,7 +4902,7 @@
               <w14:ligatures w14:val="standardContextual"/>
             </w:rPr>
           </w:pPr>
-          <w:hyperlink w:anchor="_Toc240302757" w:history="1">
+          <w:hyperlink w:anchor="_Toc240310390" w:history="1">
             <w:r>
               <w:rPr>
                 <w:rStyle w:val="Hipervnculo"/>
@@ -4929,7 +4929,7 @@
                 <w:noProof/>
                 <w:webHidden/>
               </w:rPr>
-              <w:instrText xml:space="preserve"> PAGEREF _Toc240302757 \h </w:instrText>
+              <w:instrText xml:space="preserve"> PAGEREF _Toc240310390 \h </w:instrText>
             </w:r>
             <w:r>
               <w:rPr>
@@ -4973,7 +4973,7 @@
               <w14:ligatures w14:val="standardContextual"/>
             </w:rPr>
           </w:pPr>
-          <w:hyperlink w:anchor="_Toc240302758" w:history="1">
+          <w:hyperlink w:anchor="_Toc240310391" w:history="1">
             <w:r>
               <w:rPr>
                 <w:rStyle w:val="Hipervnculo"/>
@@ -5000,7 +5000,7 @@
                 <w:noProof/>
                 <w:webHidden/>
               </w:rPr>
-              <w:instrText xml:space="preserve"> PAGEREF _Toc240302758 \h </w:instrText>
+              <w:instrText xml:space="preserve"> PAGEREF _Toc240310391 \h </w:instrText>
             </w:r>
             <w:r>
               <w:rPr>
@@ -5044,7 +5044,7 @@
               <w14:ligatures w14:val="standardContextual"/>
             </w:rPr>
           </w:pPr>
-          <w:hyperlink w:anchor="_Toc240302759" w:history="1">
+          <w:hyperlink w:anchor="_Toc240310392" w:history="1">
             <w:r>
               <w:rPr>
                 <w:rStyle w:val="Hipervnculo"/>
@@ -5071,7 +5071,7 @@
                 <w:noProof/>
                 <w:webHidden/>
               </w:rPr>
-              <w:instrText xml:space="preserve"> PAGEREF _Toc240302759 \h </w:instrText>
+              <w:instrText xml:space="preserve"> PAGEREF _Toc240310392 \h </w:instrText>
             </w:r>
             <w:r>
               <w:rPr>
@@ -5115,7 +5115,7 @@
               <w14:ligatures w14:val="standardContextual"/>
             </w:rPr>
           </w:pPr>
-          <w:hyperlink w:anchor="_Toc240302760" w:history="1">
+          <w:hyperlink w:anchor="_Toc240310393" w:history="1">
             <w:r>
               <w:rPr>
                 <w:rStyle w:val="Hipervnculo"/>
@@ -5142,7 +5142,7 @@
                 <w:noProof/>
                 <w:webHidden/>
               </w:rPr>
-              <w:instrText xml:space="preserve"> PAGEREF _Toc240302760 \h </w:instrText>
+              <w:instrText xml:space="preserve"> PAGEREF _Toc240310393 \h </w:instrText>
             </w:r>
             <w:r>
               <w:rPr>
@@ -5186,7 +5186,7 @@
               <w14:ligatures w14:val="standardContextual"/>
             </w:rPr>
           </w:pPr>
-          <w:hyperlink w:anchor="_Toc240302761" w:history="1">
+          <w:hyperlink w:anchor="_Toc240310394" w:history="1">
             <w:r>
               <w:rPr>
                 <w:rStyle w:val="Hipervnculo"/>
@@ -5213,7 +5213,7 @@
                 <w:noProof/>
                 <w:webHidden/>
               </w:rPr>
-              <w:instrText xml:space="preserve"> PAGEREF _Toc240302761 \h </w:instrText>
+              <w:instrText xml:space="preserve"> PAGEREF _Toc240310394 \h </w:instrText>
             </w:r>
             <w:r>
               <w:rPr>
@@ -5257,7 +5257,7 @@
               <w14:ligatures w14:val="standardContextual"/>
             </w:rPr>
           </w:pPr>
-          <w:hyperlink w:anchor="_Toc240302762" w:history="1">
+          <w:hyperlink w:anchor="_Toc240310395" w:history="1">
             <w:r>
               <w:rPr>
                 <w:rStyle w:val="Hipervnculo"/>
@@ -5284,7 +5284,7 @@
                 <w:noProof/>
                 <w:webHidden/>
               </w:rPr>
-              <w:instrText xml:space="preserve"> PAGEREF _Toc240302762 \h </w:instrText>
+              <w:instrText xml:space="preserve"> PAGEREF _Toc240310395 \h </w:instrText>
             </w:r>
             <w:r>
               <w:rPr>
@@ -5328,7 +5328,7 @@
               <w14:ligatures w14:val="standardContextual"/>
             </w:rPr>
           </w:pPr>
-          <w:hyperlink w:anchor="_Toc240302763" w:history="1">
+          <w:hyperlink w:anchor="_Toc240310396" w:history="1">
             <w:r>
               <w:rPr>
                 <w:rStyle w:val="Hipervnculo"/>
@@ -5355,7 +5355,7 @@
                 <w:noProof/>
                 <w:webHidden/>
               </w:rPr>
-              <w:instrText xml:space="preserve"> PAGEREF _Toc240302763 \h </w:instrText>
+              <w:instrText xml:space="preserve"> PAGEREF _Toc240310396 \h </w:instrText>
             </w:r>
             <w:r>
               <w:rPr>
@@ -5399,7 +5399,7 @@
               <w14:ligatures w14:val="standardContextual"/>
             </w:rPr>
           </w:pPr>
-          <w:hyperlink w:anchor="_Toc240302764" w:history="1">
+          <w:hyperlink w:anchor="_Toc240310397" w:history="1">
             <w:r>
               <w:rPr>
                 <w:rStyle w:val="Hipervnculo"/>
@@ -5426,7 +5426,7 @@
                 <w:noProof/>
                 <w:webHidden/>
               </w:rPr>
-              <w:instrText xml:space="preserve"> PAGEREF _Toc240302764 \h </w:instrText>
+              <w:instrText xml:space="preserve"> PAGEREF _Toc240310397 \h </w:instrText>
             </w:r>
             <w:r>
               <w:rPr>
@@ -5470,7 +5470,7 @@
               <w14:ligatures w14:val="standardContextual"/>
             </w:rPr>
           </w:pPr>
-          <w:hyperlink w:anchor="_Toc240302765" w:history="1">
+          <w:hyperlink w:anchor="_Toc240310398" w:history="1">
             <w:r>
               <w:rPr>
                 <w:rStyle w:val="Hipervnculo"/>
@@ -5497,7 +5497,7 @@
                 <w:noProof/>
                 <w:webHidden/>
               </w:rPr>
-              <w:instrText xml:space="preserve"> PAGEREF _Toc240302765 \h </w:instrText>
+              <w:instrText xml:space="preserve"> PAGEREF _Toc240310398 \h </w:instrText>
             </w:r>
             <w:r>
               <w:rPr>
@@ -5541,7 +5541,7 @@
               <w14:ligatures w14:val="standardContextual"/>
             </w:rPr>
           </w:pPr>
-          <w:hyperlink w:anchor="_Toc240302766" w:history="1">
+          <w:hyperlink w:anchor="_Toc240310399" w:history="1">
             <w:r>
               <w:rPr>
                 <w:rStyle w:val="Hipervnculo"/>
@@ -5568,7 +5568,7 @@
                 <w:noProof/>
                 <w:webHidden/>
               </w:rPr>
-              <w:instrText xml:space="preserve"> PAGEREF _Toc240302766 \h </w:instrText>
+              <w:instrText xml:space="preserve"> PAGEREF _Toc240310399 \h </w:instrText>
             </w:r>
             <w:r>
               <w:rPr>
@@ -5612,7 +5612,7 @@
               <w14:ligatures w14:val="standardContextual"/>
             </w:rPr>
           </w:pPr>
-          <w:hyperlink w:anchor="_Toc240302767" w:history="1">
+          <w:hyperlink w:anchor="_Toc240310400" w:history="1">
             <w:r>
               <w:rPr>
                 <w:rStyle w:val="Hipervnculo"/>
@@ -5639,7 +5639,7 @@
                 <w:noProof/>
                 <w:webHidden/>
               </w:rPr>
-              <w:instrText xml:space="preserve"> PAGEREF _Toc240302767 \h </w:instrText>
+              <w:instrText xml:space="preserve"> PAGEREF _Toc240310400 \h </w:instrText>
             </w:r>
             <w:r>
               <w:rPr>
@@ -5683,7 +5683,7 @@
               <w14:ligatures w14:val="standardContextual"/>
             </w:rPr>
           </w:pPr>
-          <w:hyperlink w:anchor="_Toc240302768" w:history="1">
+          <w:hyperlink w:anchor="_Toc240310401" w:history="1">
             <w:r>
               <w:rPr>
                 <w:rStyle w:val="Hipervnculo"/>
@@ -5710,7 +5710,7 @@
                 <w:noProof/>
                 <w:webHidden/>
               </w:rPr>
-              <w:instrText xml:space="preserve"> PAGEREF _Toc240302768 \h </w:instrText>
+              <w:instrText xml:space="preserve"> PAGEREF _Toc240310401 \h </w:instrText>
             </w:r>
             <w:r>
               <w:rPr>
@@ -5754,7 +5754,7 @@
               <w14:ligatures w14:val="standardContextual"/>
             </w:rPr>
           </w:pPr>
-          <w:hyperlink w:anchor="_Toc240302769" w:history="1">
+          <w:hyperlink w:anchor="_Toc240310402" w:history="1">
             <w:r>
               <w:rPr>
                 <w:rStyle w:val="Hipervnculo"/>
@@ -5781,7 +5781,7 @@
                 <w:noProof/>
                 <w:webHidden/>
               </w:rPr>
-              <w:instrText xml:space="preserve"> PAGEREF _Toc240302769 \h </w:instrText>
+              <w:instrText xml:space="preserve"> PAGEREF _Toc240310402 \h </w:instrText>
             </w:r>
             <w:r>
               <w:rPr>
@@ -5825,7 +5825,7 @@
               <w14:ligatures w14:val="standardContextual"/>
             </w:rPr>
           </w:pPr>
-          <w:hyperlink w:anchor="_Toc240302770" w:history="1">
+          <w:hyperlink w:anchor="_Toc240310403" w:history="1">
             <w:r>
               <w:rPr>
                 <w:rStyle w:val="Hipervnculo"/>
@@ -5852,7 +5852,7 @@
                 <w:noProof/>
                 <w:webHidden/>
               </w:rPr>
-              <w:instrText xml:space="preserve"> PAGEREF _Toc240302770 \h </w:instrText>
+              <w:instrText xml:space="preserve"> PAGEREF _Toc240310403 \h </w:instrText>
             </w:r>
             <w:r>
               <w:rPr>
@@ -5896,7 +5896,7 @@
               <w14:ligatures w14:val="standardContextual"/>
             </w:rPr>
           </w:pPr>
-          <w:hyperlink w:anchor="_Toc240302771" w:history="1">
+          <w:hyperlink w:anchor="_Toc240310404" w:history="1">
             <w:r>
               <w:rPr>
                 <w:rStyle w:val="Hipervnculo"/>
@@ -5923,7 +5923,7 @@
                 <w:noProof/>
                 <w:webHidden/>
               </w:rPr>
-              <w:instrText xml:space="preserve"> PAGEREF _Toc240302771 \h </w:instrText>
+              <w:instrText xml:space="preserve"> PAGEREF _Toc240310404 \h </w:instrText>
             </w:r>
             <w:r>
               <w:rPr>
@@ -5967,7 +5967,7 @@
               <w14:ligatures w14:val="standardContextual"/>
             </w:rPr>
           </w:pPr>
-          <w:hyperlink w:anchor="_Toc240302772" w:history="1">
+          <w:hyperlink w:anchor="_Toc240310405" w:history="1">
             <w:r>
               <w:rPr>
                 <w:rStyle w:val="Hipervnculo"/>
@@ -5994,7 +5994,7 @@
                 <w:noProof/>
                 <w:webHidden/>
               </w:rPr>
-              <w:instrText xml:space="preserve"> PAGEREF _Toc240302772 \h </w:instrText>
+              <w:instrText xml:space="preserve"> PAGEREF _Toc240310405 \h </w:instrText>
             </w:r>
             <w:r>
               <w:rPr>
@@ -6038,7 +6038,7 @@
               <w14:ligatures w14:val="standardContextual"/>
             </w:rPr>
           </w:pPr>
-          <w:hyperlink w:anchor="_Toc240302773" w:history="1">
+          <w:hyperlink w:anchor="_Toc240310406" w:history="1">
             <w:r>
               <w:rPr>
                 <w:rStyle w:val="Hipervnculo"/>
@@ -6065,7 +6065,7 @@
                 <w:noProof/>
                 <w:webHidden/>
               </w:rPr>
-              <w:instrText xml:space="preserve"> PAGEREF _Toc240302773 \h </w:instrText>
+              <w:instrText xml:space="preserve"> PAGEREF _Toc240310406 \h </w:instrText>
             </w:r>
             <w:r>
               <w:rPr>
@@ -6109,7 +6109,7 @@
               <w14:ligatures w14:val="standardContextual"/>
             </w:rPr>
           </w:pPr>
-          <w:hyperlink w:anchor="_Toc240302774" w:history="1">
+          <w:hyperlink w:anchor="_Toc240310407" w:history="1">
             <w:r>
               <w:rPr>
                 <w:rStyle w:val="Hipervnculo"/>
@@ -6136,7 +6136,7 @@
                 <w:noProof/>
                 <w:webHidden/>
               </w:rPr>
-              <w:instrText xml:space="preserve"> PAGEREF _Toc240302774 \h </w:instrText>
+              <w:instrText xml:space="preserve"> PAGEREF _Toc240310407 \h </w:instrText>
             </w:r>
             <w:r>
               <w:rPr>
@@ -6180,7 +6180,7 @@
               <w14:ligatures w14:val="standardContextual"/>
             </w:rPr>
           </w:pPr>
-          <w:hyperlink w:anchor="_Toc240302775" w:history="1">
+          <w:hyperlink w:anchor="_Toc240310408" w:history="1">
             <w:r>
               <w:rPr>
                 <w:rStyle w:val="Hipervnculo"/>
@@ -6207,7 +6207,7 @@
                 <w:noProof/>
                 <w:webHidden/>
               </w:rPr>
-              <w:instrText xml:space="preserve"> PAGEREF _Toc240302775 \h </w:instrText>
+              <w:instrText xml:space="preserve"> PAGEREF _Toc240310408 \h </w:instrText>
             </w:r>
             <w:r>
               <w:rPr>
@@ -6251,7 +6251,7 @@
               <w14:ligatures w14:val="standardContextual"/>
             </w:rPr>
           </w:pPr>
-          <w:hyperlink w:anchor="_Toc240302776" w:history="1">
+          <w:hyperlink w:anchor="_Toc240310409" w:history="1">
             <w:r>
               <w:rPr>
                 <w:rStyle w:val="Hipervnculo"/>
@@ -6278,7 +6278,7 @@
                 <w:noProof/>
                 <w:webHidden/>
               </w:rPr>
-              <w:instrText xml:space="preserve"> PAGEREF _Toc240302776 \h </w:instrText>
+              <w:instrText xml:space="preserve"> PAGEREF _Toc240310409 \h </w:instrText>
             </w:r>
             <w:r>
               <w:rPr>
@@ -6322,7 +6322,7 @@
               <w14:ligatures w14:val="standardContextual"/>
             </w:rPr>
           </w:pPr>
-          <w:hyperlink w:anchor="_Toc240302777" w:history="1">
+          <w:hyperlink w:anchor="_Toc240310410" w:history="1">
             <w:r>
               <w:rPr>
                 <w:rStyle w:val="Hipervnculo"/>
@@ -6349,7 +6349,7 @@
                 <w:noProof/>
                 <w:webHidden/>
               </w:rPr>
-              <w:instrText xml:space="preserve"> PAGEREF _Toc240302777 \h </w:instrText>
+              <w:instrText xml:space="preserve"> PAGEREF _Toc240310410 \h </w:instrText>
             </w:r>
             <w:r>
               <w:rPr>
@@ -6393,7 +6393,7 @@
               <w14:ligatures w14:val="standardContextual"/>
             </w:rPr>
           </w:pPr>
-          <w:hyperlink w:anchor="_Toc240302778" w:history="1">
+          <w:hyperlink w:anchor="_Toc240310411" w:history="1">
             <w:r>
               <w:rPr>
                 <w:rStyle w:val="Hipervnculo"/>
@@ -6420,7 +6420,7 @@
                 <w:noProof/>
                 <w:webHidden/>
               </w:rPr>
-              <w:instrText xml:space="preserve"> PAGEREF _Toc240302778 \h </w:instrText>
+              <w:instrText xml:space="preserve"> PAGEREF _Toc240310411 \h </w:instrText>
             </w:r>
             <w:r>
               <w:rPr>
@@ -6464,7 +6464,7 @@
               <w14:ligatures w14:val="standardContextual"/>
             </w:rPr>
           </w:pPr>
-          <w:hyperlink w:anchor="_Toc240302779" w:history="1">
+          <w:hyperlink w:anchor="_Toc240310412" w:history="1">
             <w:r>
               <w:rPr>
                 <w:rStyle w:val="Hipervnculo"/>
@@ -6491,7 +6491,7 @@
                 <w:noProof/>
                 <w:webHidden/>
               </w:rPr>
-              <w:instrText xml:space="preserve"> PAGEREF _Toc240302779 \h </w:instrText>
+              <w:instrText xml:space="preserve"> PAGEREF _Toc240310412 \h </w:instrText>
             </w:r>
             <w:r>
               <w:rPr>
@@ -6535,7 +6535,7 @@
               <w14:ligatures w14:val="standardContextual"/>
             </w:rPr>
           </w:pPr>
-          <w:hyperlink w:anchor="_Toc240302780" w:history="1">
+          <w:hyperlink w:anchor="_Toc240310413" w:history="1">
             <w:r>
               <w:rPr>
                 <w:rStyle w:val="Hipervnculo"/>
@@ -6562,7 +6562,7 @@
                 <w:noProof/>
                 <w:webHidden/>
               </w:rPr>
-              <w:instrText xml:space="preserve"> PAGEREF _Toc240302780 \h </w:instrText>
+              <w:instrText xml:space="preserve"> PAGEREF _Toc240310413 \h </w:instrText>
             </w:r>
             <w:r>
               <w:rPr>
@@ -6606,7 +6606,7 @@
               <w14:ligatures w14:val="standardContextual"/>
             </w:rPr>
           </w:pPr>
-          <w:hyperlink w:anchor="_Toc240302781" w:history="1">
+          <w:hyperlink w:anchor="_Toc240310414" w:history="1">
             <w:r>
               <w:rPr>
                 <w:rStyle w:val="Hipervnculo"/>
@@ -6633,7 +6633,7 @@
                 <w:noProof/>
                 <w:webHidden/>
               </w:rPr>
-              <w:instrText xml:space="preserve"> PAGEREF _Toc240302781 \h </w:instrText>
+              <w:instrText xml:space="preserve"> PAGEREF _Toc240310414 \h </w:instrText>
             </w:r>
             <w:r>
               <w:rPr>
@@ -6677,7 +6677,7 @@
               <w14:ligatures w14:val="standardContextual"/>
             </w:rPr>
           </w:pPr>
-          <w:hyperlink w:anchor="_Toc240302782" w:history="1">
+          <w:hyperlink w:anchor="_Toc240310415" w:history="1">
             <w:r>
               <w:rPr>
                 <w:rStyle w:val="Hipervnculo"/>
@@ -6704,7 +6704,7 @@
                 <w:noProof/>
                 <w:webHidden/>
               </w:rPr>
-              <w:instrText xml:space="preserve"> PAGEREF _Toc240302782 \h </w:instrText>
+              <w:instrText xml:space="preserve"> PAGEREF _Toc240310415 \h </w:instrText>
             </w:r>
             <w:r>
               <w:rPr>
@@ -6748,7 +6748,7 @@
               <w14:ligatures w14:val="standardContextual"/>
             </w:rPr>
           </w:pPr>
-          <w:hyperlink w:anchor="_Toc240302783" w:history="1">
+          <w:hyperlink w:anchor="_Toc240310416" w:history="1">
             <w:r>
               <w:rPr>
                 <w:rStyle w:val="Hipervnculo"/>
@@ -6775,7 +6775,7 @@
                 <w:noProof/>
                 <w:webHidden/>
               </w:rPr>
-              <w:instrText xml:space="preserve"> PAGEREF _Toc240302783 \h </w:instrText>
+              <w:instrText xml:space="preserve"> PAGEREF _Toc240310416 \h </w:instrText>
             </w:r>
             <w:r>
               <w:rPr>
@@ -6819,7 +6819,7 @@
               <w14:ligatures w14:val="standardContextual"/>
             </w:rPr>
           </w:pPr>
-          <w:hyperlink w:anchor="_Toc240302784" w:history="1">
+          <w:hyperlink w:anchor="_Toc240310417" w:history="1">
             <w:r>
               <w:rPr>
                 <w:rStyle w:val="Hipervnculo"/>
@@ -6846,7 +6846,7 @@
                 <w:noProof/>
                 <w:webHidden/>
               </w:rPr>
-              <w:instrText xml:space="preserve"> PAGEREF _Toc240302784 \h </w:instrText>
+              <w:instrText xml:space="preserve"> PAGEREF _Toc240310417 \h </w:instrText>
             </w:r>
             <w:r>
               <w:rPr>
@@ -6890,7 +6890,7 @@
               <w14:ligatures w14:val="standardContextual"/>
             </w:rPr>
           </w:pPr>
-          <w:hyperlink w:anchor="_Toc240302785" w:history="1">
+          <w:hyperlink w:anchor="_Toc240310418" w:history="1">
             <w:r>
               <w:rPr>
                 <w:rStyle w:val="Hipervnculo"/>
@@ -6917,7 +6917,7 @@
                 <w:noProof/>
                 <w:webHidden/>
               </w:rPr>
-              <w:instrText xml:space="preserve"> PAGEREF _Toc240302785 \h </w:instrText>
+              <w:instrText xml:space="preserve"> PAGEREF _Toc240310418 \h </w:instrText>
             </w:r>
             <w:r>
               <w:rPr>
@@ -6961,7 +6961,7 @@
               <w14:ligatures w14:val="standardContextual"/>
             </w:rPr>
           </w:pPr>
-          <w:hyperlink w:anchor="_Toc240302786" w:history="1">
+          <w:hyperlink w:anchor="_Toc240310419" w:history="1">
             <w:r>
               <w:rPr>
                 <w:rStyle w:val="Hipervnculo"/>
@@ -6988,7 +6988,7 @@
                 <w:noProof/>
                 <w:webHidden/>
               </w:rPr>
-              <w:instrText xml:space="preserve"> PAGEREF _Toc240302786 \h </w:instrText>
+              <w:instrText xml:space="preserve"> PAGEREF _Toc240310419 \h </w:instrText>
             </w:r>
             <w:r>
               <w:rPr>
@@ -7032,7 +7032,7 @@
               <w14:ligatures w14:val="standardContextual"/>
             </w:rPr>
           </w:pPr>
-          <w:hyperlink w:anchor="_Toc240302787" w:history="1">
+          <w:hyperlink w:anchor="_Toc240310420" w:history="1">
             <w:r>
               <w:rPr>
                 <w:rStyle w:val="Hipervnculo"/>
@@ -7059,7 +7059,7 @@
                 <w:noProof/>
                 <w:webHidden/>
               </w:rPr>
-              <w:instrText xml:space="preserve"> PAGEREF _Toc240302787 \h </w:instrText>
+              <w:instrText xml:space="preserve"> PAGEREF _Toc240310420 \h </w:instrText>
             </w:r>
             <w:r>
               <w:rPr>
@@ -7103,7 +7103,7 @@
               <w14:ligatures w14:val="standardContextual"/>
             </w:rPr>
           </w:pPr>
-          <w:hyperlink w:anchor="_Toc240302788" w:history="1">
+          <w:hyperlink w:anchor="_Toc240310421" w:history="1">
             <w:r>
               <w:rPr>
                 <w:rStyle w:val="Hipervnculo"/>
@@ -7130,7 +7130,7 @@
                 <w:noProof/>
                 <w:webHidden/>
               </w:rPr>
-              <w:instrText xml:space="preserve"> PAGEREF _Toc240302788 \h </w:instrText>
+              <w:instrText xml:space="preserve"> PAGEREF _Toc240310421 \h </w:instrText>
             </w:r>
             <w:r>
               <w:rPr>
@@ -7174,7 +7174,7 @@
               <w14:ligatures w14:val="standardContextual"/>
             </w:rPr>
           </w:pPr>
-          <w:hyperlink w:anchor="_Toc240302789" w:history="1">
+          <w:hyperlink w:anchor="_Toc240310422" w:history="1">
             <w:r>
               <w:rPr>
                 <w:rStyle w:val="Hipervnculo"/>
@@ -7201,7 +7201,7 @@
                 <w:noProof/>
                 <w:webHidden/>
               </w:rPr>
-              <w:instrText xml:space="preserve"> PAGEREF _Toc240302789 \h </w:instrText>
+              <w:instrText xml:space="preserve"> PAGEREF _Toc240310422 \h </w:instrText>
             </w:r>
             <w:r>
               <w:rPr>
@@ -7245,7 +7245,7 @@
               <w14:ligatures w14:val="standardContextual"/>
             </w:rPr>
           </w:pPr>
-          <w:hyperlink w:anchor="_Toc240302790" w:history="1">
+          <w:hyperlink w:anchor="_Toc240310423" w:history="1">
             <w:r>
               <w:rPr>
                 <w:rStyle w:val="Hipervnculo"/>
@@ -7272,7 +7272,7 @@
                 <w:noProof/>
                 <w:webHidden/>
               </w:rPr>
-              <w:instrText xml:space="preserve"> PAGEREF _Toc240302790 \h </w:instrText>
+              <w:instrText xml:space="preserve"> PAGEREF _Toc240310423 \h </w:instrText>
             </w:r>
             <w:r>
               <w:rPr>
@@ -7316,7 +7316,7 @@
               <w14:ligatures w14:val="standardContextual"/>
             </w:rPr>
           </w:pPr>
-          <w:hyperlink w:anchor="_Toc240302791" w:history="1">
+          <w:hyperlink w:anchor="_Toc240310424" w:history="1">
             <w:r>
               <w:rPr>
                 <w:rStyle w:val="Hipervnculo"/>
@@ -7343,7 +7343,7 @@
                 <w:noProof/>
                 <w:webHidden/>
               </w:rPr>
-              <w:instrText xml:space="preserve"> PAGEREF _Toc240302791 \h </w:instrText>
+              <w:instrText xml:space="preserve"> PAGEREF _Toc240310424 \h </w:instrText>
             </w:r>
             <w:r>
               <w:rPr>
@@ -7387,7 +7387,7 @@
               <w14:ligatures w14:val="standardContextual"/>
             </w:rPr>
           </w:pPr>
-          <w:hyperlink w:anchor="_Toc240302792" w:history="1">
+          <w:hyperlink w:anchor="_Toc240310425" w:history="1">
             <w:r>
               <w:rPr>
                 <w:rStyle w:val="Hipervnculo"/>
@@ -7414,7 +7414,7 @@
                 <w:noProof/>
                 <w:webHidden/>
               </w:rPr>
-              <w:instrText xml:space="preserve"> PAGEREF _Toc240302792 \h </w:instrText>
+              <w:instrText xml:space="preserve"> PAGEREF _Toc240310425 \h </w:instrText>
             </w:r>
             <w:r>
               <w:rPr>
@@ -7458,7 +7458,7 @@
               <w14:ligatures w14:val="standardContextual"/>
             </w:rPr>
           </w:pPr>
-          <w:hyperlink w:anchor="_Toc240302793" w:history="1">
+          <w:hyperlink w:anchor="_Toc240310426" w:history="1">
             <w:r>
               <w:rPr>
                 <w:rStyle w:val="Hipervnculo"/>
@@ -7485,7 +7485,7 @@
                 <w:noProof/>
                 <w:webHidden/>
               </w:rPr>
-              <w:instrText xml:space="preserve"> PAGEREF _Toc240302793 \h </w:instrText>
+              <w:instrText xml:space="preserve"> PAGEREF _Toc240310426 \h </w:instrText>
             </w:r>
             <w:r>
               <w:rPr>
@@ -7529,7 +7529,7 @@
               <w14:ligatures w14:val="standardContextual"/>
             </w:rPr>
           </w:pPr>
-          <w:hyperlink w:anchor="_Toc240302794" w:history="1">
+          <w:hyperlink w:anchor="_Toc240310427" w:history="1">
             <w:r>
               <w:rPr>
                 <w:rStyle w:val="Hipervnculo"/>
@@ -7556,7 +7556,7 @@
                 <w:noProof/>
                 <w:webHidden/>
               </w:rPr>
-              <w:instrText xml:space="preserve"> PAGEREF _Toc240302794 \h </w:instrText>
+              <w:instrText xml:space="preserve"> PAGEREF _Toc240310427 \h </w:instrText>
             </w:r>
             <w:r>
               <w:rPr>
@@ -7600,7 +7600,7 @@
               <w14:ligatures w14:val="standardContextual"/>
             </w:rPr>
           </w:pPr>
-          <w:hyperlink w:anchor="_Toc240302795" w:history="1">
+          <w:hyperlink w:anchor="_Toc240310428" w:history="1">
             <w:r>
               <w:rPr>
                 <w:rStyle w:val="Hipervnculo"/>
@@ -7627,7 +7627,7 @@
                 <w:noProof/>
                 <w:webHidden/>
               </w:rPr>
-              <w:instrText xml:space="preserve"> PAGEREF _Toc240302795 \h </w:instrText>
+              <w:instrText xml:space="preserve"> PAGEREF _Toc240310428 \h </w:instrText>
             </w:r>
             <w:r>
               <w:rPr>
@@ -7671,7 +7671,7 @@
               <w14:ligatures w14:val="standardContextual"/>
             </w:rPr>
           </w:pPr>
-          <w:hyperlink w:anchor="_Toc240302796" w:history="1">
+          <w:hyperlink w:anchor="_Toc240310429" w:history="1">
             <w:r>
               <w:rPr>
                 <w:rStyle w:val="Hipervnculo"/>
@@ -7698,7 +7698,7 @@
                 <w:noProof/>
                 <w:webHidden/>
               </w:rPr>
-              <w:instrText xml:space="preserve"> PAGEREF _Toc240302796 \h </w:instrText>
+              <w:instrText xml:space="preserve"> PAGEREF _Toc240310429 \h </w:instrText>
             </w:r>
             <w:r>
               <w:rPr>
@@ -7742,7 +7742,7 @@
               <w14:ligatures w14:val="standardContextual"/>
             </w:rPr>
           </w:pPr>
-          <w:hyperlink w:anchor="_Toc240302797" w:history="1">
+          <w:hyperlink w:anchor="_Toc240310430" w:history="1">
             <w:r>
               <w:rPr>
                 <w:rStyle w:val="Hipervnculo"/>
@@ -7769,7 +7769,7 @@
                 <w:noProof/>
                 <w:webHidden/>
               </w:rPr>
-              <w:instrText xml:space="preserve"> PAGEREF _Toc240302797 \h </w:instrText>
+              <w:instrText xml:space="preserve"> PAGEREF _Toc240310430 \h </w:instrText>
             </w:r>
             <w:r>
               <w:rPr>
@@ -7813,7 +7813,7 @@
               <w14:ligatures w14:val="standardContextual"/>
             </w:rPr>
           </w:pPr>
-          <w:hyperlink w:anchor="_Toc240302798" w:history="1">
+          <w:hyperlink w:anchor="_Toc240310431" w:history="1">
             <w:r>
               <w:rPr>
                 <w:rStyle w:val="Hipervnculo"/>
@@ -7840,7 +7840,7 @@
                 <w:noProof/>
                 <w:webHidden/>
               </w:rPr>
-              <w:instrText xml:space="preserve"> PAGEREF _Toc240302798 \h </w:instrText>
+              <w:instrText xml:space="preserve"> PAGEREF _Toc240310431 \h </w:instrText>
             </w:r>
             <w:r>
               <w:rPr>
@@ -7884,7 +7884,7 @@
               <w14:ligatures w14:val="standardContextual"/>
             </w:rPr>
           </w:pPr>
-          <w:hyperlink w:anchor="_Toc240302799" w:history="1">
+          <w:hyperlink w:anchor="_Toc240310432" w:history="1">
             <w:r>
               <w:rPr>
                 <w:rStyle w:val="Hipervnculo"/>
@@ -7911,7 +7911,7 @@
                 <w:noProof/>
                 <w:webHidden/>
               </w:rPr>
-              <w:instrText xml:space="preserve"> PAGEREF _Toc240302799 \h </w:instrText>
+              <w:instrText xml:space="preserve"> PAGEREF _Toc240310432 \h </w:instrText>
             </w:r>
             <w:r>
               <w:rPr>
@@ -7955,7 +7955,7 @@
               <w14:ligatures w14:val="standardContextual"/>
             </w:rPr>
           </w:pPr>
-          <w:hyperlink w:anchor="_Toc240302800" w:history="1">
+          <w:hyperlink w:anchor="_Toc240310433" w:history="1">
             <w:r>
               <w:rPr>
                 <w:rStyle w:val="Hipervnculo"/>
@@ -7982,7 +7982,7 @@
                 <w:noProof/>
                 <w:webHidden/>
               </w:rPr>
-              <w:instrText xml:space="preserve"> PAGEREF _Toc240302800 \h </w:instrText>
+              <w:instrText xml:space="preserve"> PAGEREF _Toc240310433 \h </w:instrText>
             </w:r>
             <w:r>
               <w:rPr>
@@ -8026,7 +8026,7 @@
               <w14:ligatures w14:val="standardContextual"/>
             </w:rPr>
           </w:pPr>
-          <w:hyperlink w:anchor="_Toc240302801" w:history="1">
+          <w:hyperlink w:anchor="_Toc240310434" w:history="1">
             <w:r>
               <w:rPr>
                 <w:rStyle w:val="Hipervnculo"/>
@@ -8053,7 +8053,7 @@
                 <w:noProof/>
                 <w:webHidden/>
               </w:rPr>
-              <w:instrText xml:space="preserve"> PAGEREF _Toc240302801 \h </w:instrText>
+              <w:instrText xml:space="preserve"> PAGEREF _Toc240310434 \h </w:instrText>
             </w:r>
             <w:r>
               <w:rPr>
@@ -8097,7 +8097,7 @@
               <w14:ligatures w14:val="standardContextual"/>
             </w:rPr>
           </w:pPr>
-          <w:hyperlink w:anchor="_Toc240302802" w:history="1">
+          <w:hyperlink w:anchor="_Toc240310435" w:history="1">
             <w:r>
               <w:rPr>
                 <w:rStyle w:val="Hipervnculo"/>
@@ -8124,7 +8124,7 @@
                 <w:noProof/>
                 <w:webHidden/>
               </w:rPr>
-              <w:instrText xml:space="preserve"> PAGEREF _Toc240302802 \h </w:instrText>
+              <w:instrText xml:space="preserve"> PAGEREF _Toc240310435 \h </w:instrText>
             </w:r>
             <w:r>
               <w:rPr>
@@ -8168,7 +8168,7 @@
               <w14:ligatures w14:val="standardContextual"/>
             </w:rPr>
           </w:pPr>
-          <w:hyperlink w:anchor="_Toc240302803" w:history="1">
+          <w:hyperlink w:anchor="_Toc240310436" w:history="1">
             <w:r>
               <w:rPr>
                 <w:rStyle w:val="Hipervnculo"/>
@@ -8195,7 +8195,7 @@
                 <w:noProof/>
                 <w:webHidden/>
               </w:rPr>
-              <w:instrText xml:space="preserve"> PAGEREF _Toc240302803 \h </w:instrText>
+              <w:instrText xml:space="preserve"> PAGEREF _Toc240310436 \h </w:instrText>
             </w:r>
             <w:r>
               <w:rPr>
@@ -8239,7 +8239,7 @@
               <w14:ligatures w14:val="standardContextual"/>
             </w:rPr>
           </w:pPr>
-          <w:hyperlink w:anchor="_Toc240302804" w:history="1">
+          <w:hyperlink w:anchor="_Toc240310437" w:history="1">
             <w:r>
               <w:rPr>
                 <w:rStyle w:val="Hipervnculo"/>
@@ -8266,7 +8266,7 @@
                 <w:noProof/>
                 <w:webHidden/>
               </w:rPr>
-              <w:instrText xml:space="preserve"> PAGEREF _Toc240302804 \h </w:instrText>
+              <w:instrText xml:space="preserve"> PAGEREF _Toc240310437 \h </w:instrText>
             </w:r>
             <w:r>
               <w:rPr>
@@ -8310,7 +8310,7 @@
               <w14:ligatures w14:val="standardContextual"/>
             </w:rPr>
           </w:pPr>
-          <w:hyperlink w:anchor="_Toc240302805" w:history="1">
+          <w:hyperlink w:anchor="_Toc240310438" w:history="1">
             <w:r>
               <w:rPr>
                 <w:rStyle w:val="Hipervnculo"/>
@@ -8337,7 +8337,7 @@
                 <w:noProof/>
                 <w:webHidden/>
               </w:rPr>
-              <w:instrText xml:space="preserve"> PAGEREF _Toc240302805 \h </w:instrText>
+              <w:instrText xml:space="preserve"> PAGEREF _Toc240310438 \h </w:instrText>
             </w:r>
             <w:r>
               <w:rPr>
@@ -8381,7 +8381,7 @@
               <w14:ligatures w14:val="standardContextual"/>
             </w:rPr>
           </w:pPr>
-          <w:hyperlink w:anchor="_Toc240302806" w:history="1">
+          <w:hyperlink w:anchor="_Toc240310439" w:history="1">
             <w:r>
               <w:rPr>
                 <w:rStyle w:val="Hipervnculo"/>
@@ -8408,7 +8408,7 @@
                 <w:noProof/>
                 <w:webHidden/>
               </w:rPr>
-              <w:instrText xml:space="preserve"> PAGEREF _Toc240302806 \h </w:instrText>
+              <w:instrText xml:space="preserve"> PAGEREF _Toc240310439 \h </w:instrText>
             </w:r>
             <w:r>
               <w:rPr>
@@ -8452,7 +8452,7 @@
               <w14:ligatures w14:val="standardContextual"/>
             </w:rPr>
           </w:pPr>
-          <w:hyperlink w:anchor="_Toc240302807" w:history="1">
+          <w:hyperlink w:anchor="_Toc240310440" w:history="1">
             <w:r>
               <w:rPr>
                 <w:rStyle w:val="Hipervnculo"/>
@@ -8479,7 +8479,7 @@
                 <w:noProof/>
                 <w:webHidden/>
               </w:rPr>
-              <w:instrText xml:space="preserve"> PAGEREF _Toc240302807 \h </w:instrText>
+              <w:instrText xml:space="preserve"> PAGEREF _Toc240310440 \h </w:instrText>
             </w:r>
             <w:r>
               <w:rPr>
@@ -8523,7 +8523,7 @@
               <w14:ligatures w14:val="standardContextual"/>
             </w:rPr>
           </w:pPr>
-          <w:hyperlink w:anchor="_Toc240302808" w:history="1">
+          <w:hyperlink w:anchor="_Toc240310441" w:history="1">
             <w:r>
               <w:rPr>
                 <w:rStyle w:val="Hipervnculo"/>
@@ -8550,7 +8550,7 @@
                 <w:noProof/>
                 <w:webHidden/>
               </w:rPr>
-              <w:instrText xml:space="preserve"> PAGEREF _Toc240302808 \h </w:instrText>
+              <w:instrText xml:space="preserve"> PAGEREF _Toc240310441 \h </w:instrText>
             </w:r>
             <w:r>
               <w:rPr>
@@ -8594,7 +8594,7 @@
               <w14:ligatures w14:val="standardContextual"/>
             </w:rPr>
           </w:pPr>
-          <w:hyperlink w:anchor="_Toc240302809" w:history="1">
+          <w:hyperlink w:anchor="_Toc240310442" w:history="1">
             <w:r>
               <w:rPr>
                 <w:rStyle w:val="Hipervnculo"/>
@@ -8621,7 +8621,7 @@
                 <w:noProof/>
                 <w:webHidden/>
               </w:rPr>
-              <w:instrText xml:space="preserve"> PAGEREF _Toc240302809 \h </w:instrText>
+              <w:instrText xml:space="preserve"> PAGEREF _Toc240310442 \h </w:instrText>
             </w:r>
             <w:r>
               <w:rPr>
@@ -8665,7 +8665,7 @@
               <w14:ligatures w14:val="standardContextual"/>
             </w:rPr>
           </w:pPr>
-          <w:hyperlink w:anchor="_Toc240302810" w:history="1">
+          <w:hyperlink w:anchor="_Toc240310443" w:history="1">
             <w:r>
               <w:rPr>
                 <w:rStyle w:val="Hipervnculo"/>
@@ -8692,7 +8692,7 @@
                 <w:noProof/>
                 <w:webHidden/>
               </w:rPr>
-              <w:instrText xml:space="preserve"> PAGEREF _Toc240302810 \h </w:instrText>
+              <w:instrText xml:space="preserve"> PAGEREF _Toc240310443 \h </w:instrText>
             </w:r>
             <w:r>
               <w:rPr>
@@ -8736,7 +8736,7 @@
               <w14:ligatures w14:val="standardContextual"/>
             </w:rPr>
           </w:pPr>
-          <w:hyperlink w:anchor="_Toc240302811" w:history="1">
+          <w:hyperlink w:anchor="_Toc240310444" w:history="1">
             <w:r>
               <w:rPr>
                 <w:rStyle w:val="Hipervnculo"/>
@@ -8763,7 +8763,7 @@
                 <w:noProof/>
                 <w:webHidden/>
               </w:rPr>
-              <w:instrText xml:space="preserve"> PAGEREF _Toc240302811 \h </w:instrText>
+              <w:instrText xml:space="preserve"> PAGEREF _Toc240310444 \h </w:instrText>
             </w:r>
             <w:r>
               <w:rPr>
@@ -8820,7 +8820,7 @@
         <w:pStyle w:val="Ttulo2"/>
       </w:pPr>
       <w:bookmarkStart w:id="4" w:name="listado-de-figuras"/>
-      <w:bookmarkStart w:id="5" w:name="_Toc240302696"/>
+      <w:bookmarkStart w:id="5" w:name="_Toc240310329"/>
       <w:r>
         <w:t>Listado de Figuras</w:t>
       </w:r>
@@ -9349,7 +9349,7 @@
         <w:pStyle w:val="Ttulo2"/>
       </w:pPr>
       <w:bookmarkStart w:id="6" w:name="listado-de-tablas-principales"/>
-      <w:bookmarkStart w:id="7" w:name="_Toc240302697"/>
+      <w:bookmarkStart w:id="7" w:name="_Toc240310330"/>
       <w:bookmarkEnd w:id="4"/>
       <w:r>
         <w:t>Listado de Tablas principales</w:t>
@@ -10514,7 +10514,7 @@
       <w:pPr>
         <w:pStyle w:val="Ttulo2"/>
       </w:pPr>
-      <w:bookmarkStart w:id="8" w:name="_Toc240302698"/>
+      <w:bookmarkStart w:id="8" w:name="_Toc240310331"/>
       <w:r>
         <w:t>Glosario de siglas y acrónimos</w:t>
       </w:r>
@@ -11360,7 +11360,7 @@
         <w:pageBreakBefore/>
       </w:pPr>
       <w:bookmarkStart w:id="9" w:name="capítulo-1-introducción"/>
-      <w:bookmarkStart w:id="10" w:name="_Toc240302699"/>
+      <w:bookmarkStart w:id="10" w:name="_Toc240310332"/>
       <w:bookmarkEnd w:id="6"/>
       <w:r>
         <w:lastRenderedPageBreak/>
@@ -11373,7 +11373,7 @@
         <w:pStyle w:val="Ttulo2"/>
       </w:pPr>
       <w:bookmarkStart w:id="11" w:name="contexto-del-problema"/>
-      <w:bookmarkStart w:id="12" w:name="_Toc240302700"/>
+      <w:bookmarkStart w:id="12" w:name="_Toc240310333"/>
       <w:r>
         <w:t>1.1 Contexto del problema</w:t>
       </w:r>
@@ -11400,7 +11400,7 @@
         <w:pStyle w:val="Ttulo2"/>
       </w:pPr>
       <w:bookmarkStart w:id="13" w:name="planteamiento-del-problema"/>
-      <w:bookmarkStart w:id="14" w:name="_Toc240302701"/>
+      <w:bookmarkStart w:id="14" w:name="_Toc240310334"/>
       <w:bookmarkEnd w:id="11"/>
       <w:r>
         <w:t>1.2 Planteamiento del problema</w:t>
@@ -11475,7 +11475,7 @@
         <w:pStyle w:val="Ttulo2"/>
       </w:pPr>
       <w:bookmarkStart w:id="15" w:name="justificación"/>
-      <w:bookmarkStart w:id="16" w:name="_Toc240302702"/>
+      <w:bookmarkStart w:id="16" w:name="_Toc240310335"/>
       <w:bookmarkEnd w:id="13"/>
       <w:r>
         <w:t>1.3 Justificación</w:t>
@@ -11540,7 +11540,7 @@
         <w:pStyle w:val="Ttulo2"/>
       </w:pPr>
       <w:bookmarkStart w:id="17" w:name="pregunta-de-investigación-e-hipótesis"/>
-      <w:bookmarkStart w:id="18" w:name="_Toc240302703"/>
+      <w:bookmarkStart w:id="18" w:name="_Toc240310336"/>
       <w:bookmarkEnd w:id="15"/>
       <w:r>
         <w:t>1.4 Pregunta de Investigación e Hipótesis</w:t>
@@ -11552,7 +11552,7 @@
         <w:pStyle w:val="Ttulo3"/>
       </w:pPr>
       <w:bookmarkStart w:id="19" w:name="pregunta-de-investigación"/>
-      <w:bookmarkStart w:id="20" w:name="_Toc240302704"/>
+      <w:bookmarkStart w:id="20" w:name="_Toc240310337"/>
       <w:r>
         <w:t>1.4.1 Pregunta de investigación</w:t>
       </w:r>
@@ -11571,7 +11571,7 @@
         <w:pStyle w:val="Ttulo3"/>
       </w:pPr>
       <w:bookmarkStart w:id="21" w:name="hipótesis"/>
-      <w:bookmarkStart w:id="22" w:name="_Toc240302705"/>
+      <w:bookmarkStart w:id="22" w:name="_Toc240310338"/>
       <w:bookmarkEnd w:id="19"/>
       <w:r>
         <w:t>1.4.2 Hipótesis</w:t>
@@ -11639,7 +11639,7 @@
         <w:pStyle w:val="Ttulo2"/>
       </w:pPr>
       <w:bookmarkStart w:id="23" w:name="objetivos"/>
-      <w:bookmarkStart w:id="24" w:name="_Toc240302706"/>
+      <w:bookmarkStart w:id="24" w:name="_Toc240310339"/>
       <w:bookmarkEnd w:id="17"/>
       <w:bookmarkEnd w:id="21"/>
       <w:r>
@@ -11652,7 +11652,7 @@
         <w:pStyle w:val="Ttulo3"/>
       </w:pPr>
       <w:bookmarkStart w:id="25" w:name="objetivo-general"/>
-      <w:bookmarkStart w:id="26" w:name="_Toc240302707"/>
+      <w:bookmarkStart w:id="26" w:name="_Toc240310340"/>
       <w:r>
         <w:t>1.5.1 Objetivo General</w:t>
       </w:r>
@@ -11671,7 +11671,7 @@
         <w:pStyle w:val="Ttulo3"/>
       </w:pPr>
       <w:bookmarkStart w:id="27" w:name="objetivos-específicos"/>
-      <w:bookmarkStart w:id="28" w:name="_Toc240302708"/>
+      <w:bookmarkStart w:id="28" w:name="_Toc240310341"/>
       <w:bookmarkEnd w:id="25"/>
       <w:r>
         <w:t>1.5.2 Objetivos Específicos</w:t>
@@ -11739,7 +11739,7 @@
         <w:pStyle w:val="Ttulo2"/>
       </w:pPr>
       <w:bookmarkStart w:id="29" w:name="alcance-y-limitaciones"/>
-      <w:bookmarkStart w:id="30" w:name="_Toc240302709"/>
+      <w:bookmarkStart w:id="30" w:name="_Toc240310342"/>
       <w:bookmarkEnd w:id="23"/>
       <w:bookmarkEnd w:id="27"/>
       <w:r>
@@ -11752,7 +11752,7 @@
         <w:pStyle w:val="Ttulo3"/>
       </w:pPr>
       <w:bookmarkStart w:id="31" w:name="alcance"/>
-      <w:bookmarkStart w:id="32" w:name="_Toc240302710"/>
+      <w:bookmarkStart w:id="32" w:name="_Toc240310343"/>
       <w:r>
         <w:t>1.6.1 Alcance</w:t>
       </w:r>
@@ -11815,7 +11815,7 @@
         <w:pStyle w:val="Ttulo3"/>
       </w:pPr>
       <w:bookmarkStart w:id="33" w:name="limitaciones"/>
-      <w:bookmarkStart w:id="34" w:name="_Toc240302711"/>
+      <w:bookmarkStart w:id="34" w:name="_Toc240310344"/>
       <w:bookmarkEnd w:id="31"/>
       <w:r>
         <w:t>1.6.2 Limitaciones</w:t>
@@ -11911,7 +11911,7 @@
         <w:pageBreakBefore/>
       </w:pPr>
       <w:bookmarkStart w:id="35" w:name="capítulo-2-marco-teórico"/>
-      <w:bookmarkStart w:id="36" w:name="_Toc240302712"/>
+      <w:bookmarkStart w:id="36" w:name="_Toc240310345"/>
       <w:bookmarkEnd w:id="9"/>
       <w:bookmarkEnd w:id="29"/>
       <w:bookmarkEnd w:id="33"/>
@@ -11926,7 +11926,7 @@
         <w:pStyle w:val="Ttulo2"/>
       </w:pPr>
       <w:bookmarkStart w:id="37" w:name="automatización-de-procesos-de-negocio"/>
-      <w:bookmarkStart w:id="38" w:name="_Toc240302713"/>
+      <w:bookmarkStart w:id="38" w:name="_Toc240310346"/>
       <w:r>
         <w:t>2.1 Automatización de procesos de negocio</w:t>
       </w:r>
@@ -11937,7 +11937,7 @@
         <w:pStyle w:val="Ttulo3"/>
       </w:pPr>
       <w:bookmarkStart w:id="39" w:name="definición-y-antecedentes"/>
-      <w:bookmarkStart w:id="40" w:name="_Toc240302714"/>
+      <w:bookmarkStart w:id="40" w:name="_Toc240310347"/>
       <w:r>
         <w:t>2.1.1 Definición y antecedentes</w:t>
       </w:r>
@@ -11994,7 +11994,7 @@
         <w:pStyle w:val="Ttulo3"/>
       </w:pPr>
       <w:bookmarkStart w:id="41" w:name="Xa3bb2ec28836d6b7a031f74afbd63d99d71d386"/>
-      <w:bookmarkStart w:id="42" w:name="_Toc240302715"/>
+      <w:bookmarkStart w:id="42" w:name="_Toc240310348"/>
       <w:bookmarkEnd w:id="39"/>
       <w:r>
         <w:t>2.1.2 Herramientas de orquestación de flujos: n8n</w:t>
@@ -12086,7 +12086,7 @@
         <w:pStyle w:val="Ttulo3"/>
       </w:pPr>
       <w:bookmarkStart w:id="43" w:name="X93fec73e5d108b013b278e4257b59246c0b4c80"/>
-      <w:bookmarkStart w:id="44" w:name="_Toc240302716"/>
+      <w:bookmarkStart w:id="44" w:name="_Toc240310349"/>
       <w:bookmarkEnd w:id="41"/>
       <w:r>
         <w:t>2.1.3 Métricas MTTD y MTTR en operaciones de e-commerce</w:t>
@@ -12200,7 +12200,7 @@
         <w:pStyle w:val="Ttulo2"/>
       </w:pPr>
       <w:bookmarkStart w:id="45" w:name="Xb9df29f5b4396af5e3e5cddfe0cff79ab4ee89d"/>
-      <w:bookmarkStart w:id="46" w:name="_Toc240302717"/>
+      <w:bookmarkStart w:id="46" w:name="_Toc240310350"/>
       <w:bookmarkEnd w:id="37"/>
       <w:bookmarkEnd w:id="43"/>
       <w:r>
@@ -12214,7 +12214,7 @@
         <w:pStyle w:val="Ttulo3"/>
       </w:pPr>
       <w:bookmarkStart w:id="47" w:name="X66ea073947c30cd45a099a94c7f07bfa1f9ff91"/>
-      <w:bookmarkStart w:id="48" w:name="_Toc240302718"/>
+      <w:bookmarkStart w:id="48" w:name="_Toc240310351"/>
       <w:r>
         <w:t>2.2.1 Evolución de los chatbots: de reglas a LLMs</w:t>
       </w:r>
@@ -12281,7 +12281,7 @@
         <w:pStyle w:val="Ttulo3"/>
       </w:pPr>
       <w:bookmarkStart w:id="49" w:name="gpt-4o-mini-y-prompt-engineering"/>
-      <w:bookmarkStart w:id="50" w:name="_Toc240302719"/>
+      <w:bookmarkStart w:id="50" w:name="_Toc240310352"/>
       <w:bookmarkEnd w:id="47"/>
       <w:r>
         <w:t>2.2.2 GPT-4o-mini y prompt engineering</w:t>
@@ -12309,7 +12309,7 @@
         <w:pStyle w:val="Ttulo3"/>
       </w:pPr>
       <w:bookmarkStart w:id="51" w:name="precisión-en-clasificación-de-intents"/>
-      <w:bookmarkStart w:id="52" w:name="_Toc240302720"/>
+      <w:bookmarkStart w:id="52" w:name="_Toc240310353"/>
       <w:bookmarkEnd w:id="49"/>
       <w:r>
         <w:lastRenderedPageBreak/>
@@ -12330,7 +12330,7 @@
         <w:pStyle w:val="Ttulo2"/>
       </w:pPr>
       <w:bookmarkStart w:id="53" w:name="comunicación-omnicanal-en-e-commerce"/>
-      <w:bookmarkStart w:id="54" w:name="_Toc240302721"/>
+      <w:bookmarkStart w:id="54" w:name="_Toc240310354"/>
       <w:bookmarkEnd w:id="45"/>
       <w:bookmarkEnd w:id="51"/>
       <w:r>
@@ -12343,7 +12343,7 @@
         <w:pStyle w:val="Ttulo3"/>
       </w:pPr>
       <w:bookmarkStart w:id="55" w:name="concepto-y-relevancia-estratégica"/>
-      <w:bookmarkStart w:id="56" w:name="_Toc240302722"/>
+      <w:bookmarkStart w:id="56" w:name="_Toc240310355"/>
       <w:r>
         <w:t>2.3.1 Multicanalidad y omnicanalidad: delimitación conceptual</w:t>
       </w:r>
@@ -12374,7 +12374,7 @@
         <w:pStyle w:val="Ttulo3"/>
       </w:pPr>
       <w:bookmarkStart w:id="57" w:name="X452ed088a5bd0b432cae0c8b943186b8d077f51"/>
-      <w:bookmarkStart w:id="58" w:name="_Toc240302723"/>
+      <w:bookmarkStart w:id="58" w:name="_Toc240310356"/>
       <w:bookmarkEnd w:id="55"/>
       <w:r>
         <w:t>2.3.2 TMR como métrica de efectividad</w:t>
@@ -12397,7 +12397,7 @@
         <w:pStyle w:val="Ttulo2"/>
       </w:pPr>
       <w:bookmarkStart w:id="59" w:name="Xaa4f6589df2a0f19e1737147622416c2cf6ca47"/>
-      <w:bookmarkStart w:id="60" w:name="_Toc240302724"/>
+      <w:bookmarkStart w:id="60" w:name="_Toc240310357"/>
       <w:bookmarkEnd w:id="53"/>
       <w:bookmarkEnd w:id="57"/>
       <w:r>
@@ -12418,7 +12418,7 @@
         <w:pStyle w:val="Ttulo3"/>
       </w:pPr>
       <w:bookmarkStart w:id="61" w:name="contenedores-docker-y-reproducibilidad"/>
-      <w:bookmarkStart w:id="62" w:name="_Toc240302725"/>
+      <w:bookmarkStart w:id="62" w:name="_Toc240310358"/>
       <w:r>
         <w:t>2.4.1 Contenedores Docker y reproducibilidad</w:t>
       </w:r>
@@ -12451,7 +12451,7 @@
         <w:pStyle w:val="Ttulo3"/>
       </w:pPr>
       <w:bookmarkStart w:id="63" w:name="X007ab7e732545dc11532fc0843ddc84b58ac216"/>
-      <w:bookmarkStart w:id="64" w:name="_Toc240302726"/>
+      <w:bookmarkStart w:id="64" w:name="_Toc240310359"/>
       <w:bookmarkEnd w:id="61"/>
       <w:r>
         <w:t>2.4.2 PostgreSQL como base de datos de métricas</w:t>
@@ -12471,7 +12471,7 @@
         <w:pStyle w:val="Ttulo3"/>
       </w:pPr>
       <w:bookmarkStart w:id="65" w:name="grafana-para-observabilidad-operativa"/>
-      <w:bookmarkStart w:id="66" w:name="_Toc240302727"/>
+      <w:bookmarkStart w:id="66" w:name="_Toc240310360"/>
       <w:bookmarkEnd w:id="63"/>
       <w:r>
         <w:t>2.4.3 Grafana para observabilidad operativa</w:t>
@@ -12490,7 +12490,7 @@
       <w:pPr>
         <w:pStyle w:val="Ttulo2"/>
       </w:pPr>
-      <w:bookmarkStart w:id="67" w:name="_Toc240302728"/>
+      <w:bookmarkStart w:id="67" w:name="_Toc240310361"/>
       <w:r>
         <w:t>2.5 Estado del arte</w:t>
       </w:r>
@@ -12525,7 +12525,7 @@
       <w:pPr>
         <w:pStyle w:val="Ttulo3"/>
       </w:pPr>
-      <w:bookmarkStart w:id="68" w:name="_Toc240302729"/>
+      <w:bookmarkStart w:id="68" w:name="_Toc240310362"/>
       <w:r>
         <w:t>2.5.1 Chatbots en la atención al cliente de comercio electrónico</w:t>
       </w:r>
@@ -12543,7 +12543,7 @@
       <w:pPr>
         <w:pStyle w:val="Ttulo3"/>
       </w:pPr>
-      <w:bookmarkStart w:id="69" w:name="_Toc240302730"/>
+      <w:bookmarkStart w:id="69" w:name="_Toc240310363"/>
       <w:r>
         <w:t>2.5.2 Clasificación de intenciones con modelos de lenguaje</w:t>
       </w:r>
@@ -12569,7 +12569,7 @@
       <w:pPr>
         <w:pStyle w:val="Ttulo3"/>
       </w:pPr>
-      <w:bookmarkStart w:id="70" w:name="_Toc240302731"/>
+      <w:bookmarkStart w:id="70" w:name="_Toc240310364"/>
       <w:r>
         <w:lastRenderedPageBreak/>
         <w:t>2.5.3 Automatización de procesos en pequeñas y medianas empresas</w:t>
@@ -12588,7 +12588,7 @@
       <w:pPr>
         <w:pStyle w:val="Ttulo3"/>
       </w:pPr>
-      <w:bookmarkStart w:id="71" w:name="_Toc240302732"/>
+      <w:bookmarkStart w:id="71" w:name="_Toc240310365"/>
       <w:r>
         <w:t>2.5.4 Antecedentes latinoamericanos y del caso argentino</w:t>
       </w:r>
@@ -12650,7 +12650,7 @@
       <w:pPr>
         <w:pStyle w:val="Ttulo3"/>
       </w:pPr>
-      <w:bookmarkStart w:id="72" w:name="_Toc240302733"/>
+      <w:bookmarkStart w:id="72" w:name="_Toc240310366"/>
       <w:r>
         <w:lastRenderedPageBreak/>
         <w:t>2.5.5 Vacío identificado y contribución de este trabajo</w:t>
@@ -13484,7 +13484,7 @@
       <w:pPr>
         <w:pStyle w:val="Ttulo2"/>
       </w:pPr>
-      <w:bookmarkStart w:id="73" w:name="_Toc240302734"/>
+      <w:bookmarkStart w:id="73" w:name="_Toc240310367"/>
       <w:r>
         <w:t>2.6 Tratamiento de datos personales y marco legal aplicable</w:t>
       </w:r>
@@ -13543,7 +13543,7 @@
         <w:pStyle w:val="Ttulo1"/>
         <w:pageBreakBefore/>
       </w:pPr>
-      <w:bookmarkStart w:id="74" w:name="_Toc240302735"/>
+      <w:bookmarkStart w:id="74" w:name="_Toc240310368"/>
       <w:r>
         <w:lastRenderedPageBreak/>
         <w:t>CAPÍTULO 3: MARCO METODOLÓGICO</w:t>
@@ -13555,7 +13555,7 @@
         <w:pStyle w:val="Ttulo2"/>
       </w:pPr>
       <w:bookmarkStart w:id="75" w:name="tipo-de-investigación"/>
-      <w:bookmarkStart w:id="76" w:name="_Toc240302736"/>
+      <w:bookmarkStart w:id="76" w:name="_Toc240310369"/>
       <w:bookmarkEnd w:id="59"/>
       <w:bookmarkEnd w:id="65"/>
       <w:r>
@@ -13586,7 +13586,7 @@
         <w:pStyle w:val="Ttulo2"/>
       </w:pPr>
       <w:bookmarkStart w:id="77" w:name="X0355707529d70f1ae0722686f2854633167fb30"/>
-      <w:bookmarkStart w:id="78" w:name="_Toc240302737"/>
+      <w:bookmarkStart w:id="78" w:name="_Toc240310370"/>
       <w:bookmarkEnd w:id="75"/>
       <w:r>
         <w:t>3.2 Enfoque y diseño: estudio de caso instrumental</w:t>
@@ -13672,7 +13672,7 @@
         <w:pStyle w:val="Ttulo2"/>
       </w:pPr>
       <w:bookmarkStart w:id="79" w:name="metodología-de-desarrollo"/>
-      <w:bookmarkStart w:id="80" w:name="_Toc240302738"/>
+      <w:bookmarkStart w:id="80" w:name="_Toc240310371"/>
       <w:bookmarkEnd w:id="77"/>
       <w:r>
         <w:t>3.3 Metodología de desarrollo</w:t>
@@ -14015,7 +14015,7 @@
         <w:pStyle w:val="Ttulo2"/>
       </w:pPr>
       <w:bookmarkStart w:id="81" w:name="herramientas-y-tecnologías"/>
-      <w:bookmarkStart w:id="82" w:name="_Toc240302739"/>
+      <w:bookmarkStart w:id="82" w:name="_Toc240310372"/>
       <w:bookmarkEnd w:id="79"/>
       <w:r>
         <w:t>3.4 Herramientas y tecnologías</w:t>
@@ -14430,7 +14430,7 @@
         <w:pStyle w:val="Ttulo2"/>
       </w:pPr>
       <w:bookmarkStart w:id="83" w:name="X52da99ba2c916cd8fb112137829dd7bab0539ad"/>
-      <w:bookmarkStart w:id="84" w:name="_Toc240302740"/>
+      <w:bookmarkStart w:id="84" w:name="_Toc240310373"/>
       <w:bookmarkEnd w:id="81"/>
       <w:r>
         <w:t>3.5 Técnicas de recolección y análisis de datos</w:t>
@@ -14442,7 +14442,7 @@
         <w:pStyle w:val="Ttulo3"/>
       </w:pPr>
       <w:bookmarkStart w:id="85" w:name="recolección-automatizada-de-métricas"/>
-      <w:bookmarkStart w:id="86" w:name="_Toc240302741"/>
+      <w:bookmarkStart w:id="86" w:name="_Toc240310374"/>
       <w:r>
         <w:t>3.5.1 Recolección automatizada de métricas</w:t>
       </w:r>
@@ -14753,7 +14753,7 @@
         <w:pStyle w:val="Ttulo3"/>
       </w:pPr>
       <w:bookmarkStart w:id="87" w:name="justificación-del-tamaño-de-muestra"/>
-      <w:bookmarkStart w:id="88" w:name="_Toc240302742"/>
+      <w:bookmarkStart w:id="88" w:name="_Toc240310375"/>
       <w:bookmarkEnd w:id="85"/>
       <w:r>
         <w:lastRenderedPageBreak/>
@@ -14782,7 +14782,7 @@
         <w:pStyle w:val="Ttulo3"/>
       </w:pPr>
       <w:bookmarkStart w:id="89" w:name="criterio-de-evaluación-de-precisión"/>
-      <w:bookmarkStart w:id="90" w:name="_Toc240302743"/>
+      <w:bookmarkStart w:id="90" w:name="_Toc240310376"/>
       <w:bookmarkEnd w:id="87"/>
       <w:r>
         <w:t>3.5.3 Criterio de evaluación de la exactitud</w:t>
@@ -14873,7 +14873,7 @@
         <w:pStyle w:val="Ttulo3"/>
       </w:pPr>
       <w:bookmarkStart w:id="91" w:name="análisis-estadístico"/>
-      <w:bookmarkStart w:id="92" w:name="_Toc240302744"/>
+      <w:bookmarkStart w:id="92" w:name="_Toc240310377"/>
       <w:bookmarkEnd w:id="89"/>
       <w:r>
         <w:t>3.5.4 Análisis estadístico</w:t>
@@ -14901,7 +14901,7 @@
       <w:pPr>
         <w:pStyle w:val="Ttulo3"/>
       </w:pPr>
-      <w:bookmarkStart w:id="93" w:name="_Toc240302745"/>
+      <w:bookmarkStart w:id="93" w:name="_Toc240310378"/>
       <w:r>
         <w:t>3.5.5 Medición del baseline de atención manual</w:t>
       </w:r>
@@ -14983,7 +14983,7 @@
       <w:pPr>
         <w:pStyle w:val="Ttulo3"/>
       </w:pPr>
-      <w:bookmarkStart w:id="94" w:name="_Toc240302746"/>
+      <w:bookmarkStart w:id="94" w:name="_Toc240310379"/>
       <w:r>
         <w:t>3.5.6 Ablación del contexto de la base de conocimiento</w:t>
       </w:r>
@@ -15029,7 +15029,7 @@
       <w:pPr>
         <w:pStyle w:val="Ttulo3"/>
       </w:pPr>
-      <w:bookmarkStart w:id="95" w:name="_Toc240302747"/>
+      <w:bookmarkStart w:id="95" w:name="_Toc240310380"/>
       <w:r>
         <w:t>3.5.7 Evaluación del contenido de las respuestas</w:t>
       </w:r>
@@ -15064,7 +15064,7 @@
         <w:pStyle w:val="Ttulo2"/>
       </w:pPr>
       <w:bookmarkStart w:id="96" w:name="amenazas-a-la-validez"/>
-      <w:bookmarkStart w:id="97" w:name="_Toc240302748"/>
+      <w:bookmarkStart w:id="97" w:name="_Toc240310381"/>
       <w:bookmarkEnd w:id="83"/>
       <w:bookmarkEnd w:id="91"/>
       <w:r>
@@ -15085,7 +15085,7 @@
         <w:pStyle w:val="Ttulo3"/>
       </w:pPr>
       <w:bookmarkStart w:id="98" w:name="validez-de-constructo"/>
-      <w:bookmarkStart w:id="99" w:name="_Toc240302749"/>
+      <w:bookmarkStart w:id="99" w:name="_Toc240310382"/>
       <w:r>
         <w:lastRenderedPageBreak/>
         <w:t>3.6.1 Validez de constructo</w:t>
@@ -15127,7 +15127,7 @@
         <w:pStyle w:val="Ttulo3"/>
       </w:pPr>
       <w:bookmarkStart w:id="100" w:name="validez-interna"/>
-      <w:bookmarkStart w:id="101" w:name="_Toc240302750"/>
+      <w:bookmarkStart w:id="101" w:name="_Toc240310383"/>
       <w:bookmarkEnd w:id="98"/>
       <w:r>
         <w:t>3.6.2 Validez interna</w:t>
@@ -15169,7 +15169,7 @@
         <w:pStyle w:val="Ttulo3"/>
       </w:pPr>
       <w:bookmarkStart w:id="102" w:name="validez-externa"/>
-      <w:bookmarkStart w:id="103" w:name="_Toc240302751"/>
+      <w:bookmarkStart w:id="103" w:name="_Toc240310384"/>
       <w:bookmarkEnd w:id="100"/>
       <w:r>
         <w:t>3.6.3 Validez externa</w:t>
@@ -15211,7 +15211,7 @@
         <w:pStyle w:val="Ttulo3"/>
       </w:pPr>
       <w:bookmarkStart w:id="104" w:name="confiabilidad"/>
-      <w:bookmarkStart w:id="105" w:name="_Toc240302752"/>
+      <w:bookmarkStart w:id="105" w:name="_Toc240310385"/>
       <w:bookmarkEnd w:id="102"/>
       <w:r>
         <w:t>3.6.4 Confiabilidad</w:t>
@@ -15251,7 +15251,7 @@
         <w:pageBreakBefore/>
       </w:pPr>
       <w:bookmarkStart w:id="106" w:name="capítulo-4-desarrollo-del-estudio"/>
-      <w:bookmarkStart w:id="107" w:name="_Toc240302753"/>
+      <w:bookmarkStart w:id="107" w:name="_Toc240310386"/>
       <w:bookmarkEnd w:id="35"/>
       <w:bookmarkEnd w:id="96"/>
       <w:bookmarkEnd w:id="104"/>
@@ -15266,7 +15266,7 @@
         <w:pStyle w:val="Ttulo2"/>
       </w:pPr>
       <w:bookmarkStart w:id="108" w:name="arquitectura-del-sistema"/>
-      <w:bookmarkStart w:id="109" w:name="_Toc240302754"/>
+      <w:bookmarkStart w:id="109" w:name="_Toc240310387"/>
       <w:r>
         <w:t>4.1 Arquitectura del sistema</w:t>
       </w:r>
@@ -15295,7 +15295,7 @@
         <w:pStyle w:val="Ttulo3"/>
       </w:pPr>
       <w:bookmarkStart w:id="110" w:name="servicios-docker"/>
-      <w:bookmarkStart w:id="111" w:name="_Toc240302755"/>
+      <w:bookmarkStart w:id="111" w:name="_Toc240310388"/>
       <w:r>
         <w:rPr>
           <w:noProof/>
@@ -15791,7 +15791,7 @@
         <w:pStyle w:val="Ttulo2"/>
       </w:pPr>
       <w:bookmarkStart w:id="112" w:name="base-de-datos"/>
-      <w:bookmarkStart w:id="113" w:name="_Toc240302756"/>
+      <w:bookmarkStart w:id="113" w:name="_Toc240310389"/>
       <w:bookmarkEnd w:id="108"/>
       <w:bookmarkEnd w:id="110"/>
       <w:r>
@@ -15804,7 +15804,7 @@
         <w:pStyle w:val="Ttulo3"/>
       </w:pPr>
       <w:bookmarkStart w:id="114" w:name="tablas-principales"/>
-      <w:bookmarkStart w:id="115" w:name="_Toc240302757"/>
+      <w:bookmarkStart w:id="115" w:name="_Toc240310390"/>
       <w:r>
         <w:t>4.2.1 Tablas principales</w:t>
       </w:r>
@@ -16271,7 +16271,7 @@
         <w:pStyle w:val="Ttulo3"/>
       </w:pPr>
       <w:bookmarkStart w:id="116" w:name="diagrama-entidad-relación"/>
-      <w:bookmarkStart w:id="117" w:name="_Toc240302758"/>
+      <w:bookmarkStart w:id="117" w:name="_Toc240310391"/>
       <w:bookmarkEnd w:id="114"/>
       <w:r>
         <w:lastRenderedPageBreak/>
@@ -16351,7 +16351,7 @@
       <w:pPr>
         <w:pStyle w:val="Ttulo3"/>
       </w:pPr>
-      <w:bookmarkStart w:id="119" w:name="_Toc240302759"/>
+      <w:bookmarkStart w:id="119" w:name="_Toc240310392"/>
       <w:r>
         <w:t>4.2.3 Vistas de métricas</w:t>
       </w:r>
@@ -16714,7 +16714,7 @@
         <w:pStyle w:val="Ttulo3"/>
       </w:pPr>
       <w:bookmarkStart w:id="120" w:name="datos-seed"/>
-      <w:bookmarkStart w:id="121" w:name="_Toc240302760"/>
+      <w:bookmarkStart w:id="121" w:name="_Toc240310393"/>
       <w:bookmarkEnd w:id="118"/>
       <w:r>
         <w:t>4.2.4 Datos seed</w:t>
@@ -18466,7 +18466,7 @@
         <w:pStyle w:val="Ttulo2"/>
       </w:pPr>
       <w:bookmarkStart w:id="122" w:name="X8f908531a063890214e0ba14e55f9da9a2ecacb"/>
-      <w:bookmarkStart w:id="123" w:name="_Toc240302761"/>
+      <w:bookmarkStart w:id="123" w:name="_Toc240310394"/>
       <w:bookmarkEnd w:id="112"/>
       <w:bookmarkEnd w:id="120"/>
       <w:r>
@@ -18523,7 +18523,7 @@
         <w:pStyle w:val="Ttulo3"/>
       </w:pPr>
       <w:bookmarkStart w:id="124" w:name="nodos-del-workflow"/>
-      <w:bookmarkStart w:id="125" w:name="_Toc240302762"/>
+      <w:bookmarkStart w:id="125" w:name="_Toc240310395"/>
       <w:r>
         <w:t>4.3.1 Nodos del workflow</w:t>
       </w:r>
@@ -19381,7 +19381,7 @@
         <w:pStyle w:val="Ttulo3"/>
       </w:pPr>
       <w:bookmarkStart w:id="126" w:name="diagrama-del-flujo"/>
-      <w:bookmarkStart w:id="127" w:name="_Toc240302763"/>
+      <w:bookmarkStart w:id="127" w:name="_Toc240310396"/>
       <w:bookmarkEnd w:id="124"/>
       <w:r>
         <w:lastRenderedPageBreak/>
@@ -19489,7 +19489,7 @@
         </w:rPr>
         <w:lastRenderedPageBreak/>
         <w:drawing>
-          <wp:inline distT="0" distB="0" distL="0" distR="0" wp14:anchorId="18F84ED2" wp14:editId="2E976618">
+          <wp:inline distT="0" distB="0" distL="0" distR="0" wp14:anchorId="18F84ED2" wp14:editId="0EDF757D">
             <wp:extent cx="5612130" cy="1259205"/>
             <wp:effectExtent l="0" t="0" r="0" b="0"/>
             <wp:docPr id="4" name="Imagen 4"/>
@@ -19551,7 +19551,7 @@
         <w:pStyle w:val="Ttulo3"/>
       </w:pPr>
       <w:bookmarkStart w:id="128" w:name="métricas-mttd-y-mttr"/>
-      <w:bookmarkStart w:id="129" w:name="_Toc240302764"/>
+      <w:bookmarkStart w:id="129" w:name="_Toc240310397"/>
       <w:bookmarkEnd w:id="126"/>
       <w:r>
         <w:t>4.3.3 Métricas MTTD y MTTR</w:t>
@@ -19657,7 +19657,7 @@
         <w:pStyle w:val="Ttulo3"/>
       </w:pPr>
       <w:bookmarkStart w:id="130" w:name="flujo-de-estados-de-una-orden"/>
-      <w:bookmarkStart w:id="131" w:name="_Toc240302765"/>
+      <w:bookmarkStart w:id="131" w:name="_Toc240310398"/>
       <w:bookmarkEnd w:id="128"/>
       <w:r>
         <w:lastRenderedPageBreak/>
@@ -20076,7 +20076,7 @@
         <w:pStyle w:val="Ttulo2"/>
       </w:pPr>
       <w:bookmarkStart w:id="132" w:name="flujo-2-chatbot-omnicanal-con-ia"/>
-      <w:bookmarkStart w:id="133" w:name="_Toc240302766"/>
+      <w:bookmarkStart w:id="133" w:name="_Toc240310399"/>
       <w:bookmarkEnd w:id="122"/>
       <w:bookmarkEnd w:id="130"/>
       <w:r>
@@ -20101,7 +20101,7 @@
         <w:pStyle w:val="Ttulo3"/>
       </w:pPr>
       <w:bookmarkStart w:id="134" w:name="nodos-del-workflow-1"/>
-      <w:bookmarkStart w:id="135" w:name="_Toc240302767"/>
+      <w:bookmarkStart w:id="135" w:name="_Toc240310400"/>
       <w:r>
         <w:t>4.4.1 Nodos del workflow</w:t>
       </w:r>
@@ -21082,7 +21082,7 @@
               <w:pStyle w:val="Compact"/>
             </w:pPr>
             <w:r>
-              <w:t>Enviar Respuesta (canal simulado)</w:t>
+              <w:t>Enviar Respuesta (Producción)</w:t>
             </w:r>
           </w:p>
         </w:tc>
@@ -21108,7 +21108,7 @@
               <w:pStyle w:val="Compact"/>
             </w:pPr>
             <w:r>
-              <w:t>Envía la respuesta por email: canal simulado en formato WhatsApp Cloud API con entrega SMTP</w:t>
+              <w:t>Envía la respuesta por email: canal simulado en formato WhatsApp Cloud API con entrega SMTP. El rótulo «(Producción)» es el que el nodo conserva en el canvas (Figura 6); pertenece a este workflow de desarrollo, no a los workflows de producción del Capítulo 7.</w:t>
             </w:r>
           </w:p>
         </w:tc>
@@ -21161,7 +21161,7 @@
         <w:pStyle w:val="Ttulo3"/>
       </w:pPr>
       <w:bookmarkStart w:id="136" w:name="diagrama-del-flujo-1"/>
-      <w:bookmarkStart w:id="137" w:name="_Toc240302768"/>
+      <w:bookmarkStart w:id="137" w:name="_Toc240310401"/>
       <w:bookmarkEnd w:id="134"/>
       <w:r>
         <w:t>4.4.2 Diagrama del flujo</w:t>
@@ -21187,7 +21187,7 @@
         </w:rPr>
         <w:lastRenderedPageBreak/>
         <w:drawing>
-          <wp:inline distT="0" distB="0" distL="0" distR="0" wp14:anchorId="263D1839" wp14:editId="7571ECD4">
+          <wp:inline distT="0" distB="0" distL="0" distR="0" wp14:anchorId="263D1839" wp14:editId="0B712685">
             <wp:extent cx="5597525" cy="5062467"/>
             <wp:effectExtent l="0" t="0" r="0" b="0"/>
             <wp:docPr id="7" name="Imagen 7"/>
@@ -21326,7 +21326,7 @@
         <w:pStyle w:val="Ttulo3"/>
       </w:pPr>
       <w:bookmarkStart w:id="138" w:name="prompt-de-ia"/>
-      <w:bookmarkStart w:id="139" w:name="_Toc240302769"/>
+      <w:bookmarkStart w:id="139" w:name="_Toc240310402"/>
       <w:bookmarkEnd w:id="136"/>
       <w:r>
         <w:lastRenderedPageBreak/>
@@ -21355,7 +21355,7 @@
         <w:pStyle w:val="Textoindependiente"/>
       </w:pPr>
       <w:r>
-        <w:t>Corresponde declarar cómo se llegó a esta precisión, porque el camino hasta ella fue equivocado y el error es instructivo. Al auditar el workflow para documentar el prompt se tomó el archivo vigente en el repositorio, que corresponde al workflow de diecinueve nodos incorporado el 27 de agosto junto con el canal de Telegram, y cuyo prompt de 1032 caracteres no inyecta la base de conocimiento ni contiene ejemplos. De ahí se concluyó que el clasificador operaba en régimen zero-shot. La corrida del corpus, sin embargo, es del 12 de agosto, quince días anterior, y se ejecutó sobre el workflow de catorce nodos cuyo prompt sí tenía ambas cosas. La auditoría fue correcta en su método y se aplicó al artefacto equivocado: se auditó la versión vigente del workflow y no la que había producido la medición. El historial de versiones del repositorio permite fechar ambas configuraciones y es lo que permitió detectar la discrepancia. Se consigna aquí porque la regla que de ello se sigue vale más que el caso: una afirmación sobre cómo se obtuvo una medición debe verificarse contra la versión del artefacto que corrió en la fecha de esa medición, no contra la versión actual.</w:t>
+        <w:t>Corresponde declarar cómo se llegó a esta precisión, porque el camino hasta ella fue equivocado y el error es instructivo. Al auditar el workflow para documentar el prompt se tomó el archivo vigente en el repositorio, que corresponde al workflow de dieciocho nodos incorporado el 27 de agosto junto con el canal de Telegram, y cuyo prompt de 1032 caracteres no inyecta la base de conocimiento ni contiene ejemplos. De ahí se concluyó que el clasificador operaba en régimen zero-shot. La corrida del corpus, sin embargo, es del 12 de agosto, quince días anterior, y se ejecutó sobre el workflow de catorce nodos cuyo prompt sí tenía ambas cosas. La auditoría fue correcta en su método y se aplicó al artefacto equivocado: se auditó la versión vigente del workflow y no la que había producido la medición. El historial de versiones del repositorio permite fechar ambas configuraciones y es lo que permitió detectar la discrepancia. Se consigna aquí porque la regla que de ello se sigue vale más que el caso: una afirmación sobre cómo se obtuvo una medición debe verificarse contra la versión del artefacto que corrió en la fecha de esa medición, no contra la versión actual.</w:t>
       </w:r>
     </w:p>
     <w:p>
@@ -21363,7 +21363,7 @@
         <w:pStyle w:val="Ttulo3"/>
       </w:pPr>
       <w:bookmarkStart w:id="140" w:name="métrica-tmr"/>
-      <w:bookmarkStart w:id="141" w:name="_Toc240302770"/>
+      <w:bookmarkStart w:id="141" w:name="_Toc240310403"/>
       <w:bookmarkEnd w:id="138"/>
       <w:r>
         <w:lastRenderedPageBreak/>
@@ -21417,7 +21417,7 @@
       <w:pPr>
         <w:pStyle w:val="Ttulo2"/>
       </w:pPr>
-      <w:bookmarkStart w:id="142" w:name="_Toc240302771"/>
+      <w:bookmarkStart w:id="142" w:name="_Toc240310404"/>
       <w:bookmarkEnd w:id="132"/>
       <w:bookmarkEnd w:id="140"/>
       <w:r>
@@ -21437,7 +21437,7 @@
       <w:pPr>
         <w:pStyle w:val="Ttulo3"/>
       </w:pPr>
-      <w:bookmarkStart w:id="143" w:name="_Toc240302772"/>
+      <w:bookmarkStart w:id="143" w:name="_Toc240310405"/>
       <w:r>
         <w:t>4.5.1 Paneles de los dashboards</w:t>
       </w:r>
@@ -22441,7 +22441,7 @@
       <w:pPr>
         <w:pStyle w:val="Ttulo2"/>
       </w:pPr>
-      <w:bookmarkStart w:id="144" w:name="_Toc240302773"/>
+      <w:bookmarkStart w:id="144" w:name="_Toc240310406"/>
       <w:r>
         <w:t>4.6 Testing</w:t>
       </w:r>
@@ -22464,7 +22464,7 @@
         <w:pStyle w:val="Ttulo3"/>
       </w:pPr>
       <w:bookmarkStart w:id="145" w:name="pruebas-funcionales"/>
-      <w:bookmarkStart w:id="146" w:name="_Toc240302774"/>
+      <w:bookmarkStart w:id="146" w:name="_Toc240310407"/>
       <w:r>
         <w:t>4.6.1 Pruebas funcionales</w:t>
       </w:r>
@@ -23231,7 +23231,7 @@
         <w:pStyle w:val="Ttulo3"/>
       </w:pPr>
       <w:bookmarkStart w:id="147" w:name="prueba-de-carga"/>
-      <w:bookmarkStart w:id="148" w:name="_Toc240302775"/>
+      <w:bookmarkStart w:id="148" w:name="_Toc240310408"/>
       <w:bookmarkEnd w:id="145"/>
       <w:r>
         <w:t>4.6.2 Pruebas de carga y de concurrencia</w:t>
@@ -23297,7 +23297,7 @@
         </w:rPr>
         <w:lastRenderedPageBreak/>
         <w:drawing>
-          <wp:inline distT="0" distB="0" distL="0" distR="0" wp14:anchorId="5B2444A2" wp14:editId="6BC165F9">
+          <wp:inline distT="0" distB="0" distL="0" distR="0" wp14:anchorId="5B2444A2" wp14:editId="0A8AD745">
             <wp:extent cx="5612130" cy="2806065"/>
             <wp:effectExtent l="0" t="0" r="0" b="0"/>
             <wp:docPr id="3" name="Imagen 3"/>
@@ -23359,7 +23359,7 @@
         <w:pStyle w:val="Ttulo1"/>
         <w:pageBreakBefore/>
       </w:pPr>
-      <w:bookmarkStart w:id="149" w:name="_Toc240302776"/>
+      <w:bookmarkStart w:id="149" w:name="_Toc240310409"/>
       <w:r>
         <w:lastRenderedPageBreak/>
         <w:t>CAPÍTULO 5: RESULTADOS Y ANÁLISIS</w:t>
@@ -23370,7 +23370,7 @@
       <w:pPr>
         <w:pStyle w:val="Ttulo2"/>
       </w:pPr>
-      <w:bookmarkStart w:id="150" w:name="_Toc240302777"/>
+      <w:bookmarkStart w:id="150" w:name="_Toc240310410"/>
       <w:bookmarkEnd w:id="147"/>
       <w:r>
         <w:t>5.1 Resultados del Flujo 1 — Pipeline de Órdenes</w:t>
@@ -23382,7 +23382,7 @@
         <w:pStyle w:val="Ttulo3"/>
       </w:pPr>
       <w:bookmarkStart w:id="151" w:name="pruebas-funcionales-1"/>
-      <w:bookmarkStart w:id="152" w:name="_Toc240302778"/>
+      <w:bookmarkStart w:id="152" w:name="_Toc240310411"/>
       <w:r>
         <w:t>5.1.1 Pruebas funcionales</w:t>
       </w:r>
@@ -23703,7 +23703,7 @@
         <w:pStyle w:val="Ttulo3"/>
       </w:pPr>
       <w:bookmarkStart w:id="153" w:name="métricas-de-tiempo"/>
-      <w:bookmarkStart w:id="154" w:name="_Toc240302779"/>
+      <w:bookmarkStart w:id="154" w:name="_Toc240310412"/>
       <w:bookmarkEnd w:id="151"/>
       <w:r>
         <w:t>5.1.2 Métricas de tiempo</w:t>
@@ -23880,7 +23880,7 @@
       <w:pPr>
         <w:pStyle w:val="Ttulo3"/>
       </w:pPr>
-      <w:bookmarkStart w:id="155" w:name="_Toc240302780"/>
+      <w:bookmarkStart w:id="155" w:name="_Toc240310413"/>
       <w:bookmarkEnd w:id="153"/>
       <w:r>
         <w:t>5.1.3 Pruebas de carga y de concurrencia</w:t>
@@ -24355,7 +24355,7 @@
       <w:pPr>
         <w:pStyle w:val="Ttulo3"/>
       </w:pPr>
-      <w:bookmarkStart w:id="156" w:name="_Toc240302781"/>
+      <w:bookmarkStart w:id="156" w:name="_Toc240310414"/>
       <w:r>
         <w:t>5.1.4 Baseline de atención manual</w:t>
       </w:r>
@@ -24814,7 +24814,7 @@
       <w:pPr>
         <w:pStyle w:val="Ttulo2"/>
       </w:pPr>
-      <w:bookmarkStart w:id="157" w:name="_Toc240302782"/>
+      <w:bookmarkStart w:id="157" w:name="_Toc240310415"/>
       <w:r>
         <w:t>5.2 Resultados del Flujo 2 — Chatbot (canal simulado formato WhatsApp y canal Telegram real)</w:t>
       </w:r>
@@ -24824,7 +24824,7 @@
       <w:pPr>
         <w:pStyle w:val="Ttulo3"/>
       </w:pPr>
-      <w:bookmarkStart w:id="158" w:name="_Toc240302783"/>
+      <w:bookmarkStart w:id="158" w:name="_Toc240310416"/>
       <w:r>
         <w:t>5.2.1 Pruebas funcionales del chatbot</w:t>
       </w:r>
@@ -24851,7 +24851,7 @@
         <w:pStyle w:val="Ttulo3"/>
       </w:pPr>
       <w:bookmarkStart w:id="159" w:name="tiempos-de-respuesta-tmr"/>
-      <w:bookmarkStart w:id="160" w:name="_Toc240302784"/>
+      <w:bookmarkStart w:id="160" w:name="_Toc240310417"/>
       <w:r>
         <w:lastRenderedPageBreak/>
         <w:t>5.2.2 Tiempos de respuesta (TMR)</w:t>
@@ -25911,7 +25911,7 @@
         <w:pStyle w:val="Ttulo3"/>
       </w:pPr>
       <w:bookmarkStart w:id="161" w:name="precisión-de-clasificación-de-intents"/>
-      <w:bookmarkStart w:id="162" w:name="_Toc240302785"/>
+      <w:bookmarkStart w:id="162" w:name="_Toc240310418"/>
       <w:bookmarkEnd w:id="159"/>
       <w:r>
         <w:t>5.2.3 Precisión de clasificación de intents</w:t>
@@ -27254,7 +27254,7 @@
       <w:pPr>
         <w:pStyle w:val="Ttulo3"/>
       </w:pPr>
-      <w:bookmarkStart w:id="163" w:name="_Toc240302786"/>
+      <w:bookmarkStart w:id="163" w:name="_Toc240310419"/>
       <w:r>
         <w:t>5.2.4 Ablación: cuánto aporta la base de conocimiento</w:t>
       </w:r>
@@ -27651,7 +27651,7 @@
       <w:pPr>
         <w:pStyle w:val="Ttulo3"/>
       </w:pPr>
-      <w:bookmarkStart w:id="164" w:name="_Toc240302787"/>
+      <w:bookmarkStart w:id="164" w:name="_Toc240310420"/>
       <w:r>
         <w:t>5.2.5 Contenido de las respuestas de tipo FAQ</w:t>
       </w:r>
@@ -27711,7 +27711,7 @@
         <w:pStyle w:val="Ttulo2"/>
       </w:pPr>
       <w:bookmarkStart w:id="165" w:name="contrastación-de-hipótesis"/>
-      <w:bookmarkStart w:id="166" w:name="_Toc240302788"/>
+      <w:bookmarkStart w:id="166" w:name="_Toc240310421"/>
       <w:bookmarkEnd w:id="161"/>
       <w:r>
         <w:t>5.3 Contrastación de hipótesis</w:t>
@@ -28061,7 +28061,7 @@
         <w:pStyle w:val="Ttulo2"/>
       </w:pPr>
       <w:bookmarkStart w:id="167" w:name="análisis-comparativo-y-discusión"/>
-      <w:bookmarkStart w:id="168" w:name="_Toc240302789"/>
+      <w:bookmarkStart w:id="168" w:name="_Toc240310422"/>
       <w:bookmarkEnd w:id="165"/>
       <w:r>
         <w:t>5.4 Análisis comparativo y discusión</w:t>
@@ -28093,7 +28093,7 @@
         <w:pStyle w:val="Ttulo3"/>
       </w:pPr>
       <w:bookmarkStart w:id="169" w:name="limitaciones-observadas"/>
-      <w:bookmarkStart w:id="170" w:name="_Toc240302790"/>
+      <w:bookmarkStart w:id="170" w:name="_Toc240310423"/>
       <w:r>
         <w:t>5.4.1 Limitaciones observadas</w:t>
       </w:r>
@@ -28234,7 +28234,7 @@
         <w:pageBreakBefore/>
       </w:pPr>
       <w:bookmarkStart w:id="171" w:name="capítulo-6-conclusiones"/>
-      <w:bookmarkStart w:id="172" w:name="_Toc240302791"/>
+      <w:bookmarkStart w:id="172" w:name="_Toc240310424"/>
       <w:bookmarkEnd w:id="106"/>
       <w:bookmarkEnd w:id="167"/>
       <w:bookmarkEnd w:id="169"/>
@@ -28249,7 +28249,7 @@
         <w:pStyle w:val="Ttulo2"/>
       </w:pPr>
       <w:bookmarkStart w:id="173" w:name="respuesta-a-la-pregunta-de-investigación"/>
-      <w:bookmarkStart w:id="174" w:name="_Toc240302792"/>
+      <w:bookmarkStart w:id="174" w:name="_Toc240310425"/>
       <w:r>
         <w:t>6.1 Respuesta a la pregunta de investigación</w:t>
       </w:r>
@@ -28283,7 +28283,7 @@
         <w:pStyle w:val="Ttulo2"/>
       </w:pPr>
       <w:bookmarkStart w:id="175" w:name="cumplimiento-de-objetivos-específicos"/>
-      <w:bookmarkStart w:id="176" w:name="_Toc240302793"/>
+      <w:bookmarkStart w:id="176" w:name="_Toc240310426"/>
       <w:bookmarkEnd w:id="173"/>
       <w:r>
         <w:t>6.2 Cumplimiento de objetivos específicos</w:t>
@@ -28683,7 +28683,7 @@
         <w:pStyle w:val="Ttulo2"/>
       </w:pPr>
       <w:bookmarkStart w:id="177" w:name="conclusiones-sustantivas"/>
-      <w:bookmarkStart w:id="178" w:name="_Toc240302794"/>
+      <w:bookmarkStart w:id="178" w:name="_Toc240310427"/>
       <w:bookmarkEnd w:id="175"/>
       <w:r>
         <w:lastRenderedPageBreak/>
@@ -28778,7 +28778,7 @@
         <w:pStyle w:val="Ttulo2"/>
       </w:pPr>
       <w:bookmarkStart w:id="179" w:name="limitaciones-del-estudio"/>
-      <w:bookmarkStart w:id="180" w:name="_Toc240302795"/>
+      <w:bookmarkStart w:id="180" w:name="_Toc240310428"/>
       <w:bookmarkEnd w:id="177"/>
       <w:r>
         <w:t>6.4 Limitaciones del estudio</w:t>
@@ -28810,7 +28810,7 @@
         <w:pageBreakBefore/>
       </w:pPr>
       <w:bookmarkStart w:id="181" w:name="capítulo-7-recomendaciones"/>
-      <w:bookmarkStart w:id="182" w:name="_Toc240302796"/>
+      <w:bookmarkStart w:id="182" w:name="_Toc240310429"/>
       <w:bookmarkEnd w:id="171"/>
       <w:bookmarkEnd w:id="179"/>
       <w:r>
@@ -28824,7 +28824,7 @@
         <w:pStyle w:val="Ttulo2"/>
       </w:pPr>
       <w:bookmarkStart w:id="183" w:name="recomendaciones-para-producción"/>
-      <w:bookmarkStart w:id="184" w:name="_Toc240302797"/>
+      <w:bookmarkStart w:id="184" w:name="_Toc240310430"/>
       <w:r>
         <w:t>7.1 Recomendaciones para producción</w:t>
       </w:r>
@@ -29155,7 +29155,7 @@
         <w:pStyle w:val="Ttulo2"/>
       </w:pPr>
       <w:bookmarkStart w:id="185" w:name="líneas-futuras"/>
-      <w:bookmarkStart w:id="186" w:name="_Toc240302798"/>
+      <w:bookmarkStart w:id="186" w:name="_Toc240310431"/>
       <w:bookmarkEnd w:id="183"/>
       <w:r>
         <w:t>7.2 Líneas futuras</w:t>
@@ -29275,7 +29275,7 @@
         <w:pageBreakBefore/>
       </w:pPr>
       <w:bookmarkStart w:id="187" w:name="capítulo-8-referencias-bibliográficas"/>
-      <w:bookmarkStart w:id="188" w:name="_Toc240302799"/>
+      <w:bookmarkStart w:id="188" w:name="_Toc240310432"/>
       <w:bookmarkEnd w:id="181"/>
       <w:bookmarkEnd w:id="185"/>
       <w:r>
@@ -30111,7 +30111,7 @@
         <w:pStyle w:val="Ttulo1"/>
         <w:pageBreakBefore/>
       </w:pPr>
-      <w:bookmarkStart w:id="189" w:name="_Toc240302800"/>
+      <w:bookmarkStart w:id="189" w:name="_Toc240310433"/>
       <w:bookmarkEnd w:id="187"/>
       <w:r>
         <w:lastRenderedPageBreak/>
@@ -30124,7 +30124,7 @@
         <w:pStyle w:val="Ttulo2"/>
       </w:pPr>
       <w:bookmarkStart w:id="190" w:name="X3cb621f708d527c85a75099c9d8ab934f4bf355"/>
-      <w:bookmarkStart w:id="191" w:name="_Toc240302801"/>
+      <w:bookmarkStart w:id="191" w:name="_Toc240310434"/>
       <w:r>
         <w:t>Anexo A: Resumen del Schema de Base de Datos</w:t>
       </w:r>
@@ -31584,7 +31584,7 @@
         <w:pStyle w:val="Ttulo2"/>
       </w:pPr>
       <w:bookmarkStart w:id="192" w:name="anexo-b-configuración-docker-compose"/>
-      <w:bookmarkStart w:id="193" w:name="_Toc240302802"/>
+      <w:bookmarkStart w:id="193" w:name="_Toc240310435"/>
       <w:bookmarkEnd w:id="190"/>
       <w:r>
         <w:t>Anexo B: Configuración Docker Compose</w:t>
@@ -32005,7 +32005,7 @@
         <w:pStyle w:val="Ttulo2"/>
       </w:pPr>
       <w:bookmarkStart w:id="194" w:name="anexo-c-catálogo-de-productos-seed"/>
-      <w:bookmarkStart w:id="195" w:name="_Toc240302803"/>
+      <w:bookmarkStart w:id="195" w:name="_Toc240310436"/>
       <w:bookmarkEnd w:id="192"/>
       <w:r>
         <w:t>Anexo C: Catálogo de Productos Seed</w:t>
@@ -33714,7 +33714,7 @@
         <w:pStyle w:val="Ttulo2"/>
       </w:pPr>
       <w:bookmarkStart w:id="196" w:name="anexo-d-faq-predefinidas"/>
-      <w:bookmarkStart w:id="197" w:name="_Toc240302804"/>
+      <w:bookmarkStart w:id="197" w:name="_Toc240310437"/>
       <w:bookmarkEnd w:id="194"/>
       <w:r>
         <w:t>Anexo D: FAQ predefinidas (base de conocimiento completa)</w:t>
@@ -34754,7 +34754,7 @@
         <w:pStyle w:val="Ttulo2"/>
       </w:pPr>
       <w:bookmarkStart w:id="198" w:name="anexo-e-comandos-de-testing"/>
-      <w:bookmarkStart w:id="199" w:name="_Toc240302805"/>
+      <w:bookmarkStart w:id="199" w:name="_Toc240310438"/>
       <w:bookmarkEnd w:id="196"/>
       <w:r>
         <w:t>Anexo E: Comandos de Testing</w:t>
@@ -35159,7 +35159,7 @@
         <w:pStyle w:val="Ttulo2"/>
       </w:pPr>
       <w:bookmarkStart w:id="200" w:name="X53963ddcb95164cb3d8d65df754d1b36e2a4f92"/>
-      <w:bookmarkStart w:id="201" w:name="_Toc240302806"/>
+      <w:bookmarkStart w:id="201" w:name="_Toc240310439"/>
       <w:bookmarkEnd w:id="198"/>
       <w:r>
         <w:t>Anexo F: Lista de Figuras — Implementación de Desarrollo (SIMPLE)</w:t>
@@ -35436,7 +35436,7 @@
       <w:pPr>
         <w:pStyle w:val="Ttulo2"/>
       </w:pPr>
-      <w:bookmarkStart w:id="202" w:name="_Toc240302807"/>
+      <w:bookmarkStart w:id="202" w:name="_Toc240310440"/>
       <w:bookmarkEnd w:id="200"/>
       <w:r>
         <w:t>Anexo G: Propuesta de Arquitectura de Producción</w:t>
@@ -35663,7 +35663,7 @@
       <w:pPr>
         <w:pStyle w:val="Ttulo2"/>
       </w:pPr>
-      <w:bookmarkStart w:id="205" w:name="_Toc240302808"/>
+      <w:bookmarkStart w:id="205" w:name="_Toc240310441"/>
       <w:r>
         <w:t>Anexo H: Prompts de sistema del clasificador de intenciones</w:t>
       </w:r>
@@ -35989,7 +35989,7 @@
       <w:pPr>
         <w:pStyle w:val="Ttulo2"/>
       </w:pPr>
-      <w:bookmarkStart w:id="206" w:name="_Toc240302809"/>
+      <w:bookmarkStart w:id="206" w:name="_Toc240310442"/>
       <w:r>
         <w:t>Anexo I: Baseline de atención manual — tiempos cronometrados</w:t>
       </w:r>
@@ -38098,7 +38098,7 @@
       <w:pPr>
         <w:pStyle w:val="Ttulo2"/>
       </w:pPr>
-      <w:bookmarkStart w:id="207" w:name="_Toc240302810"/>
+      <w:bookmarkStart w:id="207" w:name="_Toc240310443"/>
       <w:r>
         <w:t>Anexo J: Corpus de evaluación y procedimiento de cálculo estadístico</w:t>
       </w:r>
@@ -38203,7 +38203,7 @@
       <w:pPr>
         <w:pStyle w:val="Ttulo2"/>
       </w:pPr>
-      <w:bookmarkStart w:id="208" w:name="_Toc240302811"/>
+      <w:bookmarkStart w:id="208" w:name="_Toc240310444"/>
       <w:r>
         <w:lastRenderedPageBreak/>
         <w:t>Anexo K: Verificación de datos concretos en las respuestas de tipo FAQ</w:t>

</xml_diff>